<commit_message>
Polish manual layout and numbering
</commit_message>
<xml_diff>
--- a/docs/CET4Coach-User-Manual.zh-CN.docx
+++ b/docs/CET4Coach-User-Manual.zh-CN.docx
@@ -595,11 +595,6 @@
       </w:tr>
     </w:tbl>
     <w:p>
-      <w:r>
-        <w:br w:type="page"/>
-      </w:r>
-    </w:p>
-    <w:p>
       <w:pPr>
         <w:pStyle w:val="Heading1"/>
       </w:pPr>
@@ -668,6 +663,10 @@
         <w:gridCol w:w="4706"/>
       </w:tblGrid>
       <w:tr>
+        <w:trPr>
+          <w:cantSplit/>
+          <w:tblHeader/>
+        </w:trPr>
         <w:tc>
           <w:tcPr>
             <w:tcW w:type="dxa" w:w="2721"/>
@@ -680,6 +679,9 @@
             </w:tcMar>
           </w:tcPr>
           <w:p>
+            <w:pPr>
+              <w:keepNext/>
+            </w:pPr>
             <w:r/>
             <w:r>
               <w:rPr>
@@ -704,6 +706,9 @@
             </w:tcMar>
           </w:tcPr>
           <w:p>
+            <w:pPr>
+              <w:keepNext/>
+            </w:pPr>
             <w:r/>
             <w:r>
               <w:rPr>
@@ -718,6 +723,9 @@
         </w:tc>
       </w:tr>
       <w:tr>
+        <w:trPr>
+          <w:cantSplit/>
+        </w:trPr>
         <w:tc>
           <w:tcPr>
             <w:tcW w:type="dxa" w:w="2721"/>
@@ -729,6 +737,9 @@
             </w:tcMar>
           </w:tcPr>
           <w:p>
+            <w:pPr>
+              <w:keepNext/>
+            </w:pPr>
             <w:r/>
             <w:r>
               <w:rPr>
@@ -750,6 +761,9 @@
             </w:tcMar>
           </w:tcPr>
           <w:p>
+            <w:pPr>
+              <w:keepNext/>
+            </w:pPr>
             <w:r/>
             <w:r>
               <w:rPr>
@@ -762,6 +776,9 @@
         </w:tc>
       </w:tr>
       <w:tr>
+        <w:trPr>
+          <w:cantSplit/>
+        </w:trPr>
         <w:tc>
           <w:tcPr>
             <w:tcW w:type="dxa" w:w="2721"/>
@@ -773,6 +790,9 @@
             </w:tcMar>
           </w:tcPr>
           <w:p>
+            <w:pPr>
+              <w:keepNext/>
+            </w:pPr>
             <w:r/>
             <w:r>
               <w:rPr>
@@ -794,6 +814,9 @@
             </w:tcMar>
           </w:tcPr>
           <w:p>
+            <w:pPr>
+              <w:keepNext/>
+            </w:pPr>
             <w:r/>
             <w:r>
               <w:rPr>
@@ -806,6 +829,9 @@
         </w:tc>
       </w:tr>
       <w:tr>
+        <w:trPr>
+          <w:cantSplit/>
+        </w:trPr>
         <w:tc>
           <w:tcPr>
             <w:tcW w:type="dxa" w:w="2721"/>
@@ -817,6 +843,9 @@
             </w:tcMar>
           </w:tcPr>
           <w:p>
+            <w:pPr>
+              <w:keepNext/>
+            </w:pPr>
             <w:r/>
             <w:r>
               <w:rPr>
@@ -838,6 +867,9 @@
             </w:tcMar>
           </w:tcPr>
           <w:p>
+            <w:pPr>
+              <w:keepNext/>
+            </w:pPr>
             <w:r/>
             <w:r>
               <w:rPr>
@@ -850,6 +882,9 @@
         </w:tc>
       </w:tr>
       <w:tr>
+        <w:trPr>
+          <w:cantSplit/>
+        </w:trPr>
         <w:tc>
           <w:tcPr>
             <w:tcW w:type="dxa" w:w="2721"/>
@@ -861,6 +896,9 @@
             </w:tcMar>
           </w:tcPr>
           <w:p>
+            <w:pPr>
+              <w:keepNext/>
+            </w:pPr>
             <w:r/>
             <w:r>
               <w:rPr>
@@ -882,6 +920,9 @@
             </w:tcMar>
           </w:tcPr>
           <w:p>
+            <w:pPr>
+              <w:keepNext/>
+            </w:pPr>
             <w:r/>
             <w:r>
               <w:rPr>
@@ -894,6 +935,9 @@
         </w:tc>
       </w:tr>
       <w:tr>
+        <w:trPr>
+          <w:cantSplit/>
+        </w:trPr>
         <w:tc>
           <w:tcPr>
             <w:tcW w:type="dxa" w:w="2721"/>
@@ -905,6 +949,9 @@
             </w:tcMar>
           </w:tcPr>
           <w:p>
+            <w:pPr>
+              <w:keepNext/>
+            </w:pPr>
             <w:r/>
             <w:r>
               <w:rPr>
@@ -926,6 +973,9 @@
             </w:tcMar>
           </w:tcPr>
           <w:p>
+            <w:pPr>
+              <w:keepNext/>
+            </w:pPr>
             <w:r/>
             <w:r>
               <w:rPr>
@@ -938,6 +988,9 @@
         </w:tc>
       </w:tr>
       <w:tr>
+        <w:trPr>
+          <w:cantSplit/>
+        </w:trPr>
         <w:tc>
           <w:tcPr>
             <w:tcW w:type="dxa" w:w="2721"/>
@@ -949,6 +1002,9 @@
             </w:tcMar>
           </w:tcPr>
           <w:p>
+            <w:pPr>
+              <w:keepNext/>
+            </w:pPr>
             <w:r/>
             <w:r>
               <w:rPr>
@@ -970,6 +1026,9 @@
             </w:tcMar>
           </w:tcPr>
           <w:p>
+            <w:pPr>
+              <w:keepNext/>
+            </w:pPr>
             <w:r/>
             <w:r>
               <w:rPr>
@@ -982,6 +1041,9 @@
         </w:tc>
       </w:tr>
       <w:tr>
+        <w:trPr>
+          <w:cantSplit/>
+        </w:trPr>
         <w:tc>
           <w:tcPr>
             <w:tcW w:type="dxa" w:w="2721"/>
@@ -993,6 +1055,9 @@
             </w:tcMar>
           </w:tcPr>
           <w:p>
+            <w:pPr>
+              <w:keepNext/>
+            </w:pPr>
             <w:r/>
             <w:r>
               <w:rPr>
@@ -1014,6 +1079,9 @@
             </w:tcMar>
           </w:tcPr>
           <w:p>
+            <w:pPr>
+              <w:keepNext/>
+            </w:pPr>
             <w:r/>
             <w:r>
               <w:rPr>
@@ -1026,6 +1094,9 @@
         </w:tc>
       </w:tr>
       <w:tr>
+        <w:trPr>
+          <w:cantSplit/>
+        </w:trPr>
         <w:tc>
           <w:tcPr>
             <w:tcW w:type="dxa" w:w="2721"/>
@@ -1037,6 +1108,9 @@
             </w:tcMar>
           </w:tcPr>
           <w:p>
+            <w:pPr>
+              <w:keepNext/>
+            </w:pPr>
             <w:r/>
             <w:r>
               <w:rPr>
@@ -1058,6 +1132,9 @@
             </w:tcMar>
           </w:tcPr>
           <w:p>
+            <w:pPr>
+              <w:keepNext/>
+            </w:pPr>
             <w:r/>
             <w:r>
               <w:rPr>
@@ -1070,6 +1147,9 @@
         </w:tc>
       </w:tr>
       <w:tr>
+        <w:trPr>
+          <w:cantSplit/>
+        </w:trPr>
         <w:tc>
           <w:tcPr>
             <w:tcW w:type="dxa" w:w="2721"/>
@@ -1081,6 +1161,9 @@
             </w:tcMar>
           </w:tcPr>
           <w:p>
+            <w:pPr>
+              <w:keepNext/>
+            </w:pPr>
             <w:r/>
             <w:r>
               <w:rPr>
@@ -1102,6 +1185,9 @@
             </w:tcMar>
           </w:tcPr>
           <w:p>
+            <w:pPr>
+              <w:keepNext/>
+            </w:pPr>
             <w:r/>
             <w:r>
               <w:rPr>
@@ -1114,6 +1200,9 @@
         </w:tc>
       </w:tr>
       <w:tr>
+        <w:trPr>
+          <w:cantSplit/>
+        </w:trPr>
         <w:tc>
           <w:tcPr>
             <w:tcW w:type="dxa" w:w="2721"/>
@@ -1233,11 +1322,6 @@
       </w:r>
     </w:p>
     <w:p>
-      <w:r>
-        <w:br w:type="page"/>
-      </w:r>
-    </w:p>
-    <w:p>
       <w:pPr>
         <w:pStyle w:val="Heading1"/>
       </w:pPr>
@@ -1266,6 +1350,10 @@
         <w:gridCol w:w="3137"/>
       </w:tblGrid>
       <w:tr>
+        <w:trPr>
+          <w:cantSplit/>
+          <w:tblHeader/>
+        </w:trPr>
         <w:tc>
           <w:tcPr>
             <w:tcW w:type="dxa" w:w="2041"/>
@@ -1278,6 +1366,9 @@
             </w:tcMar>
           </w:tcPr>
           <w:p>
+            <w:pPr>
+              <w:keepNext/>
+            </w:pPr>
             <w:r/>
             <w:r>
               <w:rPr>
@@ -1302,6 +1393,9 @@
             </w:tcMar>
           </w:tcPr>
           <w:p>
+            <w:pPr>
+              <w:keepNext/>
+            </w:pPr>
             <w:r/>
             <w:r>
               <w:rPr>
@@ -1326,6 +1420,9 @@
             </w:tcMar>
           </w:tcPr>
           <w:p>
+            <w:pPr>
+              <w:keepNext/>
+            </w:pPr>
             <w:r/>
             <w:r>
               <w:rPr>
@@ -1340,6 +1437,9 @@
         </w:tc>
       </w:tr>
       <w:tr>
+        <w:trPr>
+          <w:cantSplit/>
+        </w:trPr>
         <w:tc>
           <w:tcPr>
             <w:tcW w:type="dxa" w:w="2041"/>
@@ -1351,6 +1451,9 @@
             </w:tcMar>
           </w:tcPr>
           <w:p>
+            <w:pPr>
+              <w:keepNext/>
+            </w:pPr>
             <w:r/>
             <w:r>
               <w:rPr>
@@ -1372,6 +1475,9 @@
             </w:tcMar>
           </w:tcPr>
           <w:p>
+            <w:pPr>
+              <w:keepNext/>
+            </w:pPr>
             <w:r/>
             <w:r>
               <w:rPr>
@@ -1393,6 +1499,9 @@
             </w:tcMar>
           </w:tcPr>
           <w:p>
+            <w:pPr>
+              <w:keepNext/>
+            </w:pPr>
             <w:r/>
             <w:r>
               <w:rPr>
@@ -1405,6 +1514,9 @@
         </w:tc>
       </w:tr>
       <w:tr>
+        <w:trPr>
+          <w:cantSplit/>
+        </w:trPr>
         <w:tc>
           <w:tcPr>
             <w:tcW w:type="dxa" w:w="2041"/>
@@ -1416,6 +1528,9 @@
             </w:tcMar>
           </w:tcPr>
           <w:p>
+            <w:pPr>
+              <w:keepNext/>
+            </w:pPr>
             <w:r/>
             <w:r>
               <w:rPr>
@@ -1437,6 +1552,9 @@
             </w:tcMar>
           </w:tcPr>
           <w:p>
+            <w:pPr>
+              <w:keepNext/>
+            </w:pPr>
             <w:r/>
             <w:r>
               <w:rPr>
@@ -1458,6 +1576,9 @@
             </w:tcMar>
           </w:tcPr>
           <w:p>
+            <w:pPr>
+              <w:keepNext/>
+            </w:pPr>
             <w:r/>
             <w:r>
               <w:rPr>
@@ -1470,6 +1591,9 @@
         </w:tc>
       </w:tr>
       <w:tr>
+        <w:trPr>
+          <w:cantSplit/>
+        </w:trPr>
         <w:tc>
           <w:tcPr>
             <w:tcW w:type="dxa" w:w="2041"/>
@@ -1481,6 +1605,9 @@
             </w:tcMar>
           </w:tcPr>
           <w:p>
+            <w:pPr>
+              <w:keepNext/>
+            </w:pPr>
             <w:r/>
             <w:r>
               <w:rPr>
@@ -1502,6 +1629,9 @@
             </w:tcMar>
           </w:tcPr>
           <w:p>
+            <w:pPr>
+              <w:keepNext/>
+            </w:pPr>
             <w:r/>
             <w:r>
               <w:rPr>
@@ -1523,6 +1653,9 @@
             </w:tcMar>
           </w:tcPr>
           <w:p>
+            <w:pPr>
+              <w:keepNext/>
+            </w:pPr>
             <w:r/>
             <w:r>
               <w:rPr>
@@ -1535,6 +1668,9 @@
         </w:tc>
       </w:tr>
       <w:tr>
+        <w:trPr>
+          <w:cantSplit/>
+        </w:trPr>
         <w:tc>
           <w:tcPr>
             <w:tcW w:type="dxa" w:w="2041"/>
@@ -1546,6 +1682,9 @@
             </w:tcMar>
           </w:tcPr>
           <w:p>
+            <w:pPr>
+              <w:keepNext/>
+            </w:pPr>
             <w:r/>
             <w:r>
               <w:rPr>
@@ -1567,6 +1706,9 @@
             </w:tcMar>
           </w:tcPr>
           <w:p>
+            <w:pPr>
+              <w:keepNext/>
+            </w:pPr>
             <w:r/>
             <w:r>
               <w:rPr>
@@ -1588,6 +1730,9 @@
             </w:tcMar>
           </w:tcPr>
           <w:p>
+            <w:pPr>
+              <w:keepNext/>
+            </w:pPr>
             <w:r/>
             <w:r>
               <w:rPr>
@@ -1600,6 +1745,9 @@
         </w:tc>
       </w:tr>
       <w:tr>
+        <w:trPr>
+          <w:cantSplit/>
+        </w:trPr>
         <w:tc>
           <w:tcPr>
             <w:tcW w:type="dxa" w:w="2041"/>
@@ -1760,57 +1908,62 @@
     </w:p>
     <w:p>
       <w:pPr>
-        <w:pStyle w:val="ListNumber"/>
+        <w:spacing w:after="60"/>
+        <w:ind w:left="425" w:hanging="369"/>
       </w:pPr>
       <w:r>
         <w:rPr>
           <w:rFonts w:ascii="Microsoft YaHei" w:hAnsi="Microsoft YaHei" w:eastAsia="Microsoft YaHei"/>
         </w:rPr>
-        <w:t>四级整卷分值、听力和阅读合计 70%。</w:t>
+        <w:t>1. 四级整卷分值、听力和阅读合计 70%。</w:t>
       </w:r>
     </w:p>
     <w:p>
       <w:pPr>
-        <w:pStyle w:val="ListNumber"/>
+        <w:spacing w:after="60"/>
+        <w:ind w:left="425" w:hanging="369"/>
       </w:pPr>
       <w:r>
         <w:rPr>
           <w:rFonts w:ascii="Microsoft YaHei" w:hAnsi="Microsoft YaHei" w:eastAsia="Microsoft YaHei"/>
         </w:rPr>
-        <w:t>听力内部：篇章题 14.2 分，是新闻/长对话的两倍。</w:t>
+        <w:t>2. 听力内部：篇章题 14.2 分，是新闻/长对话的两倍。</w:t>
       </w:r>
     </w:p>
     <w:p>
       <w:pPr>
-        <w:pStyle w:val="ListNumber"/>
+        <w:spacing w:after="60"/>
+        <w:ind w:left="425" w:hanging="369"/>
       </w:pPr>
       <w:r>
         <w:rPr>
           <w:rFonts w:ascii="Microsoft YaHei" w:hAnsi="Microsoft YaHei" w:eastAsia="Microsoft YaHei"/>
         </w:rPr>
-        <w:t>阅读内部：仔细阅读 14.2 分，选词填空 3.55 分；先做仔细阅读。</w:t>
+        <w:t>3. 阅读内部：仔细阅读 14.2 分，选词填空 3.55 分；先做仔细阅读。</w:t>
       </w:r>
     </w:p>
     <w:p>
       <w:pPr>
-        <w:pStyle w:val="ListNumber"/>
+        <w:spacing w:after="60"/>
+        <w:ind w:left="425" w:hanging="369"/>
       </w:pPr>
       <w:r>
         <w:rPr>
           <w:rFonts w:ascii="Microsoft YaHei" w:hAnsi="Microsoft YaHei" w:eastAsia="Microsoft YaHei"/>
         </w:rPr>
-        <w:t>写作和翻译各 106.5 分，靠框架和少错误稳分。</w:t>
+        <w:t>4. 写作和翻译各 106.5 分，靠框架和少错误稳分。</w:t>
       </w:r>
     </w:p>
     <w:p>
       <w:pPr>
-        <w:pStyle w:val="ListNumber"/>
+        <w:spacing w:after="60"/>
+        <w:ind w:left="425" w:hanging="369"/>
       </w:pPr>
       <w:r>
         <w:rPr>
           <w:rFonts w:ascii="Microsoft YaHei" w:hAnsi="Microsoft YaHei" w:eastAsia="Microsoft YaHei"/>
         </w:rPr>
-        <w:t>整场时间轴：写作 → 听力 → 仔细阅读 → 翻译 → 匹配 → 选词。</w:t>
+        <w:t>5. 整场时间轴：写作 → 听力 → 仔细阅读 → 翻译 → 匹配 → 选词。</w:t>
       </w:r>
     </w:p>
     <w:p>
@@ -1867,11 +2020,6 @@
       </w:tr>
     </w:tbl>
     <w:p>
-      <w:r>
-        <w:br w:type="page"/>
-      </w:r>
-    </w:p>
-    <w:p>
       <w:pPr>
         <w:pStyle w:val="Heading1"/>
       </w:pPr>
@@ -1960,6 +2108,10 @@
         <w:gridCol w:w="4706"/>
       </w:tblGrid>
       <w:tr>
+        <w:trPr>
+          <w:cantSplit/>
+          <w:tblHeader/>
+        </w:trPr>
         <w:tc>
           <w:tcPr>
             <w:tcW w:type="dxa" w:w="2551"/>
@@ -1972,6 +2124,9 @@
             </w:tcMar>
           </w:tcPr>
           <w:p>
+            <w:pPr>
+              <w:keepNext/>
+            </w:pPr>
             <w:r/>
             <w:r>
               <w:rPr>
@@ -1996,6 +2151,9 @@
             </w:tcMar>
           </w:tcPr>
           <w:p>
+            <w:pPr>
+              <w:keepNext/>
+            </w:pPr>
             <w:r/>
             <w:r>
               <w:rPr>
@@ -2010,6 +2168,9 @@
         </w:tc>
       </w:tr>
       <w:tr>
+        <w:trPr>
+          <w:cantSplit/>
+        </w:trPr>
         <w:tc>
           <w:tcPr>
             <w:tcW w:type="dxa" w:w="2551"/>
@@ -2021,6 +2182,9 @@
             </w:tcMar>
           </w:tcPr>
           <w:p>
+            <w:pPr>
+              <w:keepNext/>
+            </w:pPr>
             <w:r/>
             <w:r>
               <w:rPr>
@@ -2042,6 +2206,9 @@
             </w:tcMar>
           </w:tcPr>
           <w:p>
+            <w:pPr>
+              <w:keepNext/>
+            </w:pPr>
             <w:r/>
             <w:r>
               <w:rPr>
@@ -2054,6 +2221,9 @@
         </w:tc>
       </w:tr>
       <w:tr>
+        <w:trPr>
+          <w:cantSplit/>
+        </w:trPr>
         <w:tc>
           <w:tcPr>
             <w:tcW w:type="dxa" w:w="2551"/>
@@ -2065,6 +2235,9 @@
             </w:tcMar>
           </w:tcPr>
           <w:p>
+            <w:pPr>
+              <w:keepNext/>
+            </w:pPr>
             <w:r/>
             <w:r>
               <w:rPr>
@@ -2086,6 +2259,9 @@
             </w:tcMar>
           </w:tcPr>
           <w:p>
+            <w:pPr>
+              <w:keepNext/>
+            </w:pPr>
             <w:r/>
             <w:r>
               <w:rPr>
@@ -2098,6 +2274,9 @@
         </w:tc>
       </w:tr>
       <w:tr>
+        <w:trPr>
+          <w:cantSplit/>
+        </w:trPr>
         <w:tc>
           <w:tcPr>
             <w:tcW w:type="dxa" w:w="2551"/>
@@ -2109,6 +2288,9 @@
             </w:tcMar>
           </w:tcPr>
           <w:p>
+            <w:pPr>
+              <w:keepNext/>
+            </w:pPr>
             <w:r/>
             <w:r>
               <w:rPr>
@@ -2130,6 +2312,9 @@
             </w:tcMar>
           </w:tcPr>
           <w:p>
+            <w:pPr>
+              <w:keepNext/>
+            </w:pPr>
             <w:r/>
             <w:r>
               <w:rPr>
@@ -2142,6 +2327,9 @@
         </w:tc>
       </w:tr>
       <w:tr>
+        <w:trPr>
+          <w:cantSplit/>
+        </w:trPr>
         <w:tc>
           <w:tcPr>
             <w:tcW w:type="dxa" w:w="2551"/>
@@ -2153,6 +2341,9 @@
             </w:tcMar>
           </w:tcPr>
           <w:p>
+            <w:pPr>
+              <w:keepNext/>
+            </w:pPr>
             <w:r/>
             <w:r>
               <w:rPr>
@@ -2174,6 +2365,9 @@
             </w:tcMar>
           </w:tcPr>
           <w:p>
+            <w:pPr>
+              <w:keepNext/>
+            </w:pPr>
             <w:r/>
             <w:r>
               <w:rPr>
@@ -2186,6 +2380,9 @@
         </w:tc>
       </w:tr>
       <w:tr>
+        <w:trPr>
+          <w:cantSplit/>
+        </w:trPr>
         <w:tc>
           <w:tcPr>
             <w:tcW w:type="dxa" w:w="2551"/>
@@ -2197,6 +2394,9 @@
             </w:tcMar>
           </w:tcPr>
           <w:p>
+            <w:pPr>
+              <w:keepNext/>
+            </w:pPr>
             <w:r/>
             <w:r>
               <w:rPr>
@@ -2218,6 +2418,9 @@
             </w:tcMar>
           </w:tcPr>
           <w:p>
+            <w:pPr>
+              <w:keepNext/>
+            </w:pPr>
             <w:r/>
             <w:r>
               <w:rPr>
@@ -2230,6 +2433,9 @@
         </w:tc>
       </w:tr>
       <w:tr>
+        <w:trPr>
+          <w:cantSplit/>
+        </w:trPr>
         <w:tc>
           <w:tcPr>
             <w:tcW w:type="dxa" w:w="2551"/>
@@ -2241,6 +2447,9 @@
             </w:tcMar>
           </w:tcPr>
           <w:p>
+            <w:pPr>
+              <w:keepNext/>
+            </w:pPr>
             <w:r/>
             <w:r>
               <w:rPr>
@@ -2262,6 +2471,9 @@
             </w:tcMar>
           </w:tcPr>
           <w:p>
+            <w:pPr>
+              <w:keepNext/>
+            </w:pPr>
             <w:r/>
             <w:r>
               <w:rPr>
@@ -2274,6 +2486,9 @@
         </w:tc>
       </w:tr>
       <w:tr>
+        <w:trPr>
+          <w:cantSplit/>
+        </w:trPr>
         <w:tc>
           <w:tcPr>
             <w:tcW w:type="dxa" w:w="2551"/>
@@ -2345,11 +2560,6 @@
       </w:r>
     </w:p>
     <w:p>
-      <w:r>
-        <w:br w:type="page"/>
-      </w:r>
-    </w:p>
-    <w:p>
       <w:pPr>
         <w:pStyle w:val="Heading1"/>
       </w:pPr>
@@ -2376,35 +2586,38 @@
     </w:p>
     <w:p>
       <w:pPr>
-        <w:pStyle w:val="ListNumber"/>
+        <w:spacing w:after="60"/>
+        <w:ind w:left="425" w:hanging="369"/>
       </w:pPr>
       <w:r>
         <w:rPr>
           <w:rFonts w:ascii="Microsoft YaHei" w:hAnsi="Microsoft YaHei" w:eastAsia="Microsoft YaHei"/>
         </w:rPr>
-        <w:t>根据你的进度，从 750 个核心词和 750 个认识词中各取约 13 个新词。</w:t>
+        <w:t>1. 根据你的进度，从 750 个核心词和 750 个认识词中各取约 13 个新词。</w:t>
       </w:r>
     </w:p>
     <w:p>
       <w:pPr>
-        <w:pStyle w:val="ListNumber"/>
+        <w:spacing w:after="60"/>
+        <w:ind w:left="425" w:hanging="369"/>
       </w:pPr>
       <w:r>
         <w:rPr>
           <w:rFonts w:ascii="Microsoft YaHei" w:hAnsi="Microsoft YaHei" w:eastAsia="Microsoft YaHei"/>
         </w:rPr>
-        <w:t>把昨天/更早到期的错词加入复习，总词量最多 48 个。</w:t>
+        <w:t>2. 把昨天/更早到期的错词加入复习，总词量最多 48 个。</w:t>
       </w:r>
     </w:p>
     <w:p>
       <w:pPr>
-        <w:pStyle w:val="ListNumber"/>
+        <w:spacing w:after="60"/>
+        <w:ind w:left="425" w:hanging="369"/>
       </w:pPr>
       <w:r>
         <w:rPr>
           <w:rFonts w:ascii="Microsoft YaHei" w:hAnsi="Microsoft YaHei" w:eastAsia="Microsoft YaHei"/>
         </w:rPr>
-        <w:t>读取今天刷题计划需要的听力，复制到临时工作区。没有听力也不影响单词。</w:t>
+        <w:t>3. 读取今天刷题计划需要的听力，复制到临时工作区。没有听力也不影响单词。</w:t>
       </w:r>
     </w:p>
     <w:p>
@@ -2595,6 +2808,10 @@
         <w:gridCol w:w="3137"/>
       </w:tblGrid>
       <w:tr>
+        <w:trPr>
+          <w:cantSplit/>
+          <w:tblHeader/>
+        </w:trPr>
         <w:tc>
           <w:tcPr>
             <w:tcW w:type="dxa" w:w="1814"/>
@@ -2607,6 +2824,9 @@
             </w:tcMar>
           </w:tcPr>
           <w:p>
+            <w:pPr>
+              <w:keepNext/>
+            </w:pPr>
             <w:r/>
             <w:r>
               <w:rPr>
@@ -2631,6 +2851,9 @@
             </w:tcMar>
           </w:tcPr>
           <w:p>
+            <w:pPr>
+              <w:keepNext/>
+            </w:pPr>
             <w:r/>
             <w:r>
               <w:rPr>
@@ -2655,6 +2878,9 @@
             </w:tcMar>
           </w:tcPr>
           <w:p>
+            <w:pPr>
+              <w:keepNext/>
+            </w:pPr>
             <w:r/>
             <w:r>
               <w:rPr>
@@ -2669,6 +2895,9 @@
         </w:tc>
       </w:tr>
       <w:tr>
+        <w:trPr>
+          <w:cantSplit/>
+        </w:trPr>
         <w:tc>
           <w:tcPr>
             <w:tcW w:type="dxa" w:w="1814"/>
@@ -2680,6 +2909,9 @@
             </w:tcMar>
           </w:tcPr>
           <w:p>
+            <w:pPr>
+              <w:keepNext/>
+            </w:pPr>
             <w:r/>
             <w:r>
               <w:rPr>
@@ -2701,6 +2933,9 @@
             </w:tcMar>
           </w:tcPr>
           <w:p>
+            <w:pPr>
+              <w:keepNext/>
+            </w:pPr>
             <w:r/>
             <w:r>
               <w:rPr>
@@ -2722,6 +2957,9 @@
             </w:tcMar>
           </w:tcPr>
           <w:p>
+            <w:pPr>
+              <w:keepNext/>
+            </w:pPr>
             <w:r/>
             <w:r>
               <w:rPr>
@@ -2734,6 +2972,9 @@
         </w:tc>
       </w:tr>
       <w:tr>
+        <w:trPr>
+          <w:cantSplit/>
+        </w:trPr>
         <w:tc>
           <w:tcPr>
             <w:tcW w:type="dxa" w:w="1814"/>
@@ -2745,6 +2986,9 @@
             </w:tcMar>
           </w:tcPr>
           <w:p>
+            <w:pPr>
+              <w:keepNext/>
+            </w:pPr>
             <w:r/>
             <w:r>
               <w:rPr>
@@ -2766,6 +3010,9 @@
             </w:tcMar>
           </w:tcPr>
           <w:p>
+            <w:pPr>
+              <w:keepNext/>
+            </w:pPr>
             <w:r/>
             <w:r>
               <w:rPr>
@@ -2787,6 +3034,9 @@
             </w:tcMar>
           </w:tcPr>
           <w:p>
+            <w:pPr>
+              <w:keepNext/>
+            </w:pPr>
             <w:r/>
             <w:r>
               <w:rPr>
@@ -2799,6 +3049,9 @@
         </w:tc>
       </w:tr>
       <w:tr>
+        <w:trPr>
+          <w:cantSplit/>
+        </w:trPr>
         <w:tc>
           <w:tcPr>
             <w:tcW w:type="dxa" w:w="1814"/>
@@ -2949,11 +3202,6 @@
       </w:r>
     </w:p>
     <w:p>
-      <w:r>
-        <w:br w:type="page"/>
-      </w:r>
-    </w:p>
-    <w:p>
       <w:pPr>
         <w:pStyle w:val="Heading1"/>
       </w:pPr>
@@ -3069,68 +3317,74 @@
     </w:p>
     <w:p>
       <w:pPr>
-        <w:pStyle w:val="ListNumber"/>
+        <w:spacing w:after="60"/>
+        <w:ind w:left="425" w:hanging="369"/>
       </w:pPr>
       <w:r>
         <w:rPr>
           <w:rFonts w:ascii="Microsoft YaHei" w:hAnsi="Microsoft YaHei" w:eastAsia="Microsoft YaHei"/>
         </w:rPr>
-        <w:t>阅读题：左侧显示文章，下面是题干和选项。先读题干圈关键词，再回原文找同义替换。</w:t>
+        <w:t>1. 阅读题：左侧显示文章，下面是题干和选项。先读题干圈关键词，再回原文找同义替换。</w:t>
       </w:r>
     </w:p>
     <w:p>
       <w:pPr>
-        <w:pStyle w:val="ListNumber"/>
+        <w:spacing w:after="60"/>
+        <w:ind w:left="425" w:hanging="369"/>
       </w:pPr>
       <w:r>
         <w:rPr>
           <w:rFonts w:ascii="Microsoft YaHei" w:hAnsi="Microsoft YaHei" w:eastAsia="Microsoft YaHei"/>
         </w:rPr>
-        <w:t>听力题：先点“播放听力”，PotPlayer 打开；听完点“我已听完，显示选项”。播放次数会被记录。</w:t>
+        <w:t>2. 听力题：先点“播放听力”，PotPlayer 打开；听完点“我已听完，显示选项”。播放次数会被记录。</w:t>
       </w:r>
     </w:p>
     <w:p>
       <w:pPr>
-        <w:pStyle w:val="ListNumber"/>
+        <w:spacing w:after="60"/>
+        <w:ind w:left="425" w:hanging="369"/>
       </w:pPr>
       <w:r>
         <w:rPr>
           <w:rFonts w:ascii="Microsoft YaHei" w:hAnsi="Microsoft YaHei" w:eastAsia="Microsoft YaHei"/>
         </w:rPr>
-        <w:t>选择答案；4 个选项用单选按钮，多于 4 个（匹配/选词）用下拉框。</w:t>
+        <w:t>3. 选择答案；4 个选项用单选按钮，多于 4 个（匹配/选词）用下拉框。</w:t>
       </w:r>
     </w:p>
     <w:p>
       <w:pPr>
-        <w:pStyle w:val="ListNumber"/>
+        <w:spacing w:after="60"/>
+        <w:ind w:left="425" w:hanging="369"/>
       </w:pPr>
       <w:r>
         <w:rPr>
           <w:rFonts w:ascii="Microsoft YaHei" w:hAnsi="Microsoft YaHei" w:eastAsia="Microsoft YaHei"/>
         </w:rPr>
-        <w:t>在理由框写一句中文：我选 B，因为原文 however 后面说……</w:t>
+        <w:t>4. 在理由框写一句中文：我选 B，因为原文 however 后面说……</w:t>
       </w:r>
     </w:p>
     <w:p>
       <w:pPr>
-        <w:pStyle w:val="ListNumber"/>
+        <w:spacing w:after="60"/>
+        <w:ind w:left="425" w:hanging="369"/>
       </w:pPr>
       <w:r>
         <w:rPr>
           <w:rFonts w:ascii="Microsoft YaHei" w:hAnsi="Microsoft YaHei" w:eastAsia="Microsoft YaHei"/>
         </w:rPr>
-        <w:t>点“提交答案和理由”。系统先本地判对错，再调用 DeepSeek 评估理由质量。</w:t>
+        <w:t>5. 点“提交答案和理由”。系统先本地判对错，再调用 DeepSeek 评估理由质量。</w:t>
       </w:r>
     </w:p>
     <w:p>
       <w:pPr>
-        <w:pStyle w:val="ListNumber"/>
+        <w:spacing w:after="60"/>
+        <w:ind w:left="425" w:hanging="369"/>
       </w:pPr>
       <w:r>
         <w:rPr>
           <w:rFonts w:ascii="Microsoft YaHei" w:hAnsi="Microsoft YaHei" w:eastAsia="Microsoft YaHei"/>
         </w:rPr>
-        <w:t>看完反馈点“下一题”。不点不会自动跳。</w:t>
+        <w:t>6. 看完反馈点“下一题”。不点不会自动跳。</w:t>
       </w:r>
     </w:p>
     <w:p>
@@ -3284,11 +3538,6 @@
       </w:r>
     </w:p>
     <w:p>
-      <w:r>
-        <w:br w:type="page"/>
-      </w:r>
-    </w:p>
-    <w:p>
       <w:pPr>
         <w:pStyle w:val="Heading1"/>
       </w:pPr>
@@ -3316,6 +3565,10 @@
         <w:gridCol w:w="4706"/>
       </w:tblGrid>
       <w:tr>
+        <w:trPr>
+          <w:cantSplit/>
+          <w:tblHeader/>
+        </w:trPr>
         <w:tc>
           <w:tcPr>
             <w:tcW w:type="dxa" w:w="2381"/>
@@ -3328,6 +3581,9 @@
             </w:tcMar>
           </w:tcPr>
           <w:p>
+            <w:pPr>
+              <w:keepNext/>
+            </w:pPr>
             <w:r/>
             <w:r>
               <w:rPr>
@@ -3352,6 +3608,9 @@
             </w:tcMar>
           </w:tcPr>
           <w:p>
+            <w:pPr>
+              <w:keepNext/>
+            </w:pPr>
             <w:r/>
             <w:r>
               <w:rPr>
@@ -3366,6 +3625,9 @@
         </w:tc>
       </w:tr>
       <w:tr>
+        <w:trPr>
+          <w:cantSplit/>
+        </w:trPr>
         <w:tc>
           <w:tcPr>
             <w:tcW w:type="dxa" w:w="2381"/>
@@ -3377,6 +3639,9 @@
             </w:tcMar>
           </w:tcPr>
           <w:p>
+            <w:pPr>
+              <w:keepNext/>
+            </w:pPr>
             <w:r/>
             <w:r>
               <w:rPr>
@@ -3398,6 +3663,9 @@
             </w:tcMar>
           </w:tcPr>
           <w:p>
+            <w:pPr>
+              <w:keepNext/>
+            </w:pPr>
             <w:r/>
             <w:r>
               <w:rPr>
@@ -3410,6 +3678,9 @@
         </w:tc>
       </w:tr>
       <w:tr>
+        <w:trPr>
+          <w:cantSplit/>
+        </w:trPr>
         <w:tc>
           <w:tcPr>
             <w:tcW w:type="dxa" w:w="2381"/>
@@ -3421,6 +3692,9 @@
             </w:tcMar>
           </w:tcPr>
           <w:p>
+            <w:pPr>
+              <w:keepNext/>
+            </w:pPr>
             <w:r/>
             <w:r>
               <w:rPr>
@@ -3442,6 +3716,9 @@
             </w:tcMar>
           </w:tcPr>
           <w:p>
+            <w:pPr>
+              <w:keepNext/>
+            </w:pPr>
             <w:r/>
             <w:r>
               <w:rPr>
@@ -3454,6 +3731,9 @@
         </w:tc>
       </w:tr>
       <w:tr>
+        <w:trPr>
+          <w:cantSplit/>
+        </w:trPr>
         <w:tc>
           <w:tcPr>
             <w:tcW w:type="dxa" w:w="2381"/>
@@ -3465,6 +3745,9 @@
             </w:tcMar>
           </w:tcPr>
           <w:p>
+            <w:pPr>
+              <w:keepNext/>
+            </w:pPr>
             <w:r/>
             <w:r>
               <w:rPr>
@@ -3486,6 +3769,9 @@
             </w:tcMar>
           </w:tcPr>
           <w:p>
+            <w:pPr>
+              <w:keepNext/>
+            </w:pPr>
             <w:r/>
             <w:r>
               <w:rPr>
@@ -3498,6 +3784,9 @@
         </w:tc>
       </w:tr>
       <w:tr>
+        <w:trPr>
+          <w:cantSplit/>
+        </w:trPr>
         <w:tc>
           <w:tcPr>
             <w:tcW w:type="dxa" w:w="2381"/>
@@ -3509,6 +3798,9 @@
             </w:tcMar>
           </w:tcPr>
           <w:p>
+            <w:pPr>
+              <w:keepNext/>
+            </w:pPr>
             <w:r/>
             <w:r>
               <w:rPr>
@@ -3530,6 +3822,9 @@
             </w:tcMar>
           </w:tcPr>
           <w:p>
+            <w:pPr>
+              <w:keepNext/>
+            </w:pPr>
             <w:r/>
             <w:r>
               <w:rPr>
@@ -3542,6 +3837,9 @@
         </w:tc>
       </w:tr>
       <w:tr>
+        <w:trPr>
+          <w:cantSplit/>
+        </w:trPr>
         <w:tc>
           <w:tcPr>
             <w:tcW w:type="dxa" w:w="2381"/>
@@ -3553,6 +3851,9 @@
             </w:tcMar>
           </w:tcPr>
           <w:p>
+            <w:pPr>
+              <w:keepNext/>
+            </w:pPr>
             <w:r/>
             <w:r>
               <w:rPr>
@@ -3574,6 +3875,9 @@
             </w:tcMar>
           </w:tcPr>
           <w:p>
+            <w:pPr>
+              <w:keepNext/>
+            </w:pPr>
             <w:r/>
             <w:r>
               <w:rPr>
@@ -3586,6 +3890,9 @@
         </w:tc>
       </w:tr>
       <w:tr>
+        <w:trPr>
+          <w:cantSplit/>
+        </w:trPr>
         <w:tc>
           <w:tcPr>
             <w:tcW w:type="dxa" w:w="2381"/>
@@ -3666,57 +3973,62 @@
     </w:p>
     <w:p>
       <w:pPr>
-        <w:pStyle w:val="ListNumber"/>
+        <w:spacing w:after="60"/>
+        <w:ind w:left="425" w:hanging="369"/>
       </w:pPr>
       <w:r>
         <w:rPr>
           <w:rFonts w:ascii="Microsoft YaHei" w:hAnsi="Microsoft YaHei" w:eastAsia="Microsoft YaHei"/>
         </w:rPr>
-        <w:t>先看“这道题考什么”，不要先看正确答案。</w:t>
+        <w:t>1. 先看“这道题考什么”，不要先看正确答案。</w:t>
       </w:r>
     </w:p>
     <w:p>
       <w:pPr>
-        <w:pStyle w:val="ListNumber"/>
+        <w:spacing w:after="60"/>
+        <w:ind w:left="425" w:hanging="369"/>
       </w:pPr>
       <w:r>
         <w:rPr>
           <w:rFonts w:ascii="Microsoft YaHei" w:hAnsi="Microsoft YaHei" w:eastAsia="Microsoft YaHei"/>
         </w:rPr>
-        <w:t>回原文/听力信号词，找出定位句。</w:t>
+        <w:t>2. 回原文/听力信号词，找出定位句。</w:t>
       </w:r>
     </w:p>
     <w:p>
       <w:pPr>
-        <w:pStyle w:val="ListNumber"/>
+        <w:spacing w:after="60"/>
+        <w:ind w:left="425" w:hanging="369"/>
       </w:pPr>
       <w:r>
         <w:rPr>
           <w:rFonts w:ascii="Microsoft YaHei" w:hAnsi="Microsoft YaHei" w:eastAsia="Microsoft YaHei"/>
         </w:rPr>
-        <w:t>比较你选的选项和定位句：是偷换主语、答非所问，还是同义替换没认出。</w:t>
+        <w:t>3. 比较你选的选项和定位句：是偷换主语、答非所问，还是同义替换没认出。</w:t>
       </w:r>
     </w:p>
     <w:p>
       <w:pPr>
-        <w:pStyle w:val="ListNumber"/>
+        <w:spacing w:after="60"/>
+        <w:ind w:left="425" w:hanging="369"/>
       </w:pPr>
       <w:r>
         <w:rPr>
           <w:rFonts w:ascii="Microsoft YaHei" w:hAnsi="Microsoft YaHei" w:eastAsia="Microsoft YaHei"/>
         </w:rPr>
-        <w:t>只记一个下次动作，例如“先找 but 后面”。</w:t>
+        <w:t>4. 只记一个下次动作，例如“先找 but 后面”。</w:t>
       </w:r>
     </w:p>
     <w:p>
       <w:pPr>
-        <w:pStyle w:val="ListNumber"/>
+        <w:spacing w:after="60"/>
+        <w:ind w:left="425" w:hanging="369"/>
       </w:pPr>
       <w:r>
         <w:rPr>
           <w:rFonts w:ascii="Microsoft YaHei" w:hAnsi="Microsoft YaHei" w:eastAsia="Microsoft YaHei"/>
         </w:rPr>
-        <w:t>隔天再做一次；如果只是记住答案，不算掌握。</w:t>
+        <w:t>5. 隔天再做一次；如果只是记住答案，不算掌握。</w:t>
       </w:r>
     </w:p>
     <w:tbl>
@@ -3764,11 +4076,6 @@
       </w:tr>
     </w:tbl>
     <w:p>
-      <w:r>
-        <w:br w:type="page"/>
-      </w:r>
-    </w:p>
-    <w:p>
       <w:pPr>
         <w:pStyle w:val="Heading1"/>
       </w:pPr>
@@ -3905,11 +4212,6 @@
       </w:r>
     </w:p>
     <w:p>
-      <w:r>
-        <w:br w:type="page"/>
-      </w:r>
-    </w:p>
-    <w:p>
       <w:pPr>
         <w:pStyle w:val="Heading1"/>
       </w:pPr>
@@ -3938,6 +4240,10 @@
         <w:gridCol w:w="3137"/>
       </w:tblGrid>
       <w:tr>
+        <w:trPr>
+          <w:cantSplit/>
+          <w:tblHeader/>
+        </w:trPr>
         <w:tc>
           <w:tcPr>
             <w:tcW w:type="dxa" w:w="1984"/>
@@ -3950,6 +4256,9 @@
             </w:tcMar>
           </w:tcPr>
           <w:p>
+            <w:pPr>
+              <w:keepNext/>
+            </w:pPr>
             <w:r/>
             <w:r>
               <w:rPr>
@@ -3974,6 +4283,9 @@
             </w:tcMar>
           </w:tcPr>
           <w:p>
+            <w:pPr>
+              <w:keepNext/>
+            </w:pPr>
             <w:r/>
             <w:r>
               <w:rPr>
@@ -3998,6 +4310,9 @@
             </w:tcMar>
           </w:tcPr>
           <w:p>
+            <w:pPr>
+              <w:keepNext/>
+            </w:pPr>
             <w:r/>
             <w:r>
               <w:rPr>
@@ -4012,6 +4327,9 @@
         </w:tc>
       </w:tr>
       <w:tr>
+        <w:trPr>
+          <w:cantSplit/>
+        </w:trPr>
         <w:tc>
           <w:tcPr>
             <w:tcW w:type="dxa" w:w="1984"/>
@@ -4023,6 +4341,9 @@
             </w:tcMar>
           </w:tcPr>
           <w:p>
+            <w:pPr>
+              <w:keepNext/>
+            </w:pPr>
             <w:r/>
             <w:r>
               <w:rPr>
@@ -4044,6 +4365,9 @@
             </w:tcMar>
           </w:tcPr>
           <w:p>
+            <w:pPr>
+              <w:keepNext/>
+            </w:pPr>
             <w:r/>
             <w:r>
               <w:rPr>
@@ -4065,6 +4389,9 @@
             </w:tcMar>
           </w:tcPr>
           <w:p>
+            <w:pPr>
+              <w:keepNext/>
+            </w:pPr>
             <w:r/>
             <w:r>
               <w:rPr>
@@ -4077,6 +4404,9 @@
         </w:tc>
       </w:tr>
       <w:tr>
+        <w:trPr>
+          <w:cantSplit/>
+        </w:trPr>
         <w:tc>
           <w:tcPr>
             <w:tcW w:type="dxa" w:w="1984"/>
@@ -4161,68 +4491,74 @@
     </w:p>
     <w:p>
       <w:pPr>
-        <w:pStyle w:val="ListNumber"/>
+        <w:spacing w:after="60"/>
+        <w:ind w:left="425" w:hanging="369"/>
       </w:pPr>
       <w:r>
         <w:rPr>
           <w:rFonts w:ascii="Microsoft YaHei" w:hAnsi="Microsoft YaHei" w:eastAsia="Microsoft YaHei"/>
         </w:rPr>
-        <w:t>把原始素材放进 library/source_audio。</w:t>
+        <w:t>1. 把原始素材放进 library/source_audio。</w:t>
       </w:r>
     </w:p>
     <w:p>
       <w:pPr>
-        <w:pStyle w:val="ListNumber"/>
+        <w:spacing w:after="60"/>
+        <w:ind w:left="425" w:hanging="369"/>
       </w:pPr>
       <w:r>
         <w:rPr>
           <w:rFonts w:ascii="Microsoft YaHei" w:hAnsi="Microsoft YaHei" w:eastAsia="Microsoft YaHei"/>
         </w:rPr>
-        <w:t>打开“听力整理”，确认 ffmpeg 状态。</w:t>
+        <w:t>2. 打开“听力整理”，确认 ffmpeg 状态。</w:t>
       </w:r>
     </w:p>
     <w:p>
       <w:pPr>
-        <w:pStyle w:val="ListNumber"/>
+        <w:spacing w:after="60"/>
+        <w:ind w:left="425" w:hanging="369"/>
       </w:pPr>
       <w:r>
         <w:rPr>
           <w:rFonts w:ascii="Microsoft YaHei" w:hAnsi="Microsoft YaHei" w:eastAsia="Microsoft YaHei"/>
         </w:rPr>
-        <w:t>点“开始整理”。程序扫描文件名/目录，识别年份、月份、套号、Section。</w:t>
+        <w:t>3. 点“开始整理”。程序扫描文件名/目录，识别年份、月份、套号、Section。</w:t>
       </w:r>
     </w:p>
     <w:p>
       <w:pPr>
-        <w:pStyle w:val="ListNumber"/>
+        <w:spacing w:after="60"/>
+        <w:ind w:left="425" w:hanging="369"/>
       </w:pPr>
       <w:r>
         <w:rPr>
           <w:rFonts w:ascii="Microsoft YaHei" w:hAnsi="Microsoft YaHei" w:eastAsia="Microsoft YaHei"/>
         </w:rPr>
-        <w:t>已分 Section：复制到 library/audio/&lt;套卷&gt;/SectionA.mp3。</w:t>
+        <w:t>4. 已分 Section：复制到 library/audio/&lt;套卷&gt;/SectionA.mp3。</w:t>
       </w:r>
     </w:p>
     <w:p>
       <w:pPr>
-        <w:pStyle w:val="ListNumber"/>
+        <w:spacing w:after="60"/>
+        <w:ind w:left="425" w:hanging="369"/>
       </w:pPr>
       <w:r>
         <w:rPr>
           <w:rFonts w:ascii="Microsoft YaHei" w:hAnsi="Microsoft YaHei" w:eastAsia="Microsoft YaHei"/>
         </w:rPr>
-        <w:t>整卷：只有时间点明确才切；没有就跳过并写缺失报告，绝不猜。</w:t>
+        <w:t>5. 整卷：只有时间点明确才切；没有就跳过并写缺失报告，绝不猜。</w:t>
       </w:r>
     </w:p>
     <w:p>
       <w:pPr>
-        <w:pStyle w:val="ListNumber"/>
+        <w:spacing w:after="60"/>
+        <w:ind w:left="425" w:hanging="369"/>
       </w:pPr>
       <w:r>
         <w:rPr>
           <w:rFonts w:ascii="Microsoft YaHei" w:hAnsi="Microsoft YaHei" w:eastAsia="Microsoft YaHei"/>
         </w:rPr>
-        <w:t>看缺失报告，补素材或补时间点后重新整理。</w:t>
+        <w:t>6. 看缺失报告，补素材或补时间点后重新整理。</w:t>
       </w:r>
     </w:p>
     <w:p>
@@ -4370,11 +4706,6 @@
       </w:r>
     </w:p>
     <w:p>
-      <w:r>
-        <w:br w:type="page"/>
-      </w:r>
-    </w:p>
-    <w:p>
       <w:pPr>
         <w:pStyle w:val="Heading1"/>
       </w:pPr>
@@ -4444,6 +4775,10 @@
         <w:gridCol w:w="3137"/>
       </w:tblGrid>
       <w:tr>
+        <w:trPr>
+          <w:cantSplit/>
+          <w:tblHeader/>
+        </w:trPr>
         <w:tc>
           <w:tcPr>
             <w:tcW w:type="dxa" w:w="1984"/>
@@ -4456,6 +4791,9 @@
             </w:tcMar>
           </w:tcPr>
           <w:p>
+            <w:pPr>
+              <w:keepNext/>
+            </w:pPr>
             <w:r/>
             <w:r>
               <w:rPr>
@@ -4480,6 +4818,9 @@
             </w:tcMar>
           </w:tcPr>
           <w:p>
+            <w:pPr>
+              <w:keepNext/>
+            </w:pPr>
             <w:r/>
             <w:r>
               <w:rPr>
@@ -4504,6 +4845,9 @@
             </w:tcMar>
           </w:tcPr>
           <w:p>
+            <w:pPr>
+              <w:keepNext/>
+            </w:pPr>
             <w:r/>
             <w:r>
               <w:rPr>
@@ -4518,6 +4862,9 @@
         </w:tc>
       </w:tr>
       <w:tr>
+        <w:trPr>
+          <w:cantSplit/>
+        </w:trPr>
         <w:tc>
           <w:tcPr>
             <w:tcW w:type="dxa" w:w="1984"/>
@@ -4529,6 +4876,9 @@
             </w:tcMar>
           </w:tcPr>
           <w:p>
+            <w:pPr>
+              <w:keepNext/>
+            </w:pPr>
             <w:r/>
             <w:r>
               <w:rPr>
@@ -4550,6 +4900,9 @@
             </w:tcMar>
           </w:tcPr>
           <w:p>
+            <w:pPr>
+              <w:keepNext/>
+            </w:pPr>
             <w:r/>
             <w:r>
               <w:rPr>
@@ -4571,6 +4924,9 @@
             </w:tcMar>
           </w:tcPr>
           <w:p>
+            <w:pPr>
+              <w:keepNext/>
+            </w:pPr>
             <w:r/>
             <w:r>
               <w:rPr>
@@ -4583,6 +4939,9 @@
         </w:tc>
       </w:tr>
       <w:tr>
+        <w:trPr>
+          <w:cantSplit/>
+        </w:trPr>
         <w:tc>
           <w:tcPr>
             <w:tcW w:type="dxa" w:w="1984"/>
@@ -4770,11 +5129,6 @@
       </w:tr>
     </w:tbl>
     <w:p>
-      <w:r>
-        <w:br w:type="page"/>
-      </w:r>
-    </w:p>
-    <w:p>
       <w:pPr>
         <w:pStyle w:val="Heading1"/>
       </w:pPr>
@@ -4875,6 +5229,10 @@
         <w:gridCol w:w="3137"/>
       </w:tblGrid>
       <w:tr>
+        <w:trPr>
+          <w:cantSplit/>
+          <w:tblHeader/>
+        </w:trPr>
         <w:tc>
           <w:tcPr>
             <w:tcW w:type="dxa" w:w="2665"/>
@@ -4887,6 +5245,9 @@
             </w:tcMar>
           </w:tcPr>
           <w:p>
+            <w:pPr>
+              <w:keepNext/>
+            </w:pPr>
             <w:r/>
             <w:r>
               <w:rPr>
@@ -4911,6 +5272,9 @@
             </w:tcMar>
           </w:tcPr>
           <w:p>
+            <w:pPr>
+              <w:keepNext/>
+            </w:pPr>
             <w:r/>
             <w:r>
               <w:rPr>
@@ -4935,6 +5299,9 @@
             </w:tcMar>
           </w:tcPr>
           <w:p>
+            <w:pPr>
+              <w:keepNext/>
+            </w:pPr>
             <w:r/>
             <w:r>
               <w:rPr>
@@ -4949,6 +5316,9 @@
         </w:tc>
       </w:tr>
       <w:tr>
+        <w:trPr>
+          <w:cantSplit/>
+        </w:trPr>
         <w:tc>
           <w:tcPr>
             <w:tcW w:type="dxa" w:w="2665"/>
@@ -4960,6 +5330,9 @@
             </w:tcMar>
           </w:tcPr>
           <w:p>
+            <w:pPr>
+              <w:keepNext/>
+            </w:pPr>
             <w:r/>
             <w:r>
               <w:rPr>
@@ -4981,6 +5354,9 @@
             </w:tcMar>
           </w:tcPr>
           <w:p>
+            <w:pPr>
+              <w:keepNext/>
+            </w:pPr>
             <w:r/>
             <w:r>
               <w:rPr>
@@ -5002,6 +5378,9 @@
             </w:tcMar>
           </w:tcPr>
           <w:p>
+            <w:pPr>
+              <w:keepNext/>
+            </w:pPr>
             <w:r/>
             <w:r>
               <w:rPr>
@@ -5014,6 +5393,9 @@
         </w:tc>
       </w:tr>
       <w:tr>
+        <w:trPr>
+          <w:cantSplit/>
+        </w:trPr>
         <w:tc>
           <w:tcPr>
             <w:tcW w:type="dxa" w:w="2665"/>
@@ -5025,6 +5407,9 @@
             </w:tcMar>
           </w:tcPr>
           <w:p>
+            <w:pPr>
+              <w:keepNext/>
+            </w:pPr>
             <w:r/>
             <w:r>
               <w:rPr>
@@ -5046,6 +5431,9 @@
             </w:tcMar>
           </w:tcPr>
           <w:p>
+            <w:pPr>
+              <w:keepNext/>
+            </w:pPr>
             <w:r/>
             <w:r>
               <w:rPr>
@@ -5067,6 +5455,9 @@
             </w:tcMar>
           </w:tcPr>
           <w:p>
+            <w:pPr>
+              <w:keepNext/>
+            </w:pPr>
             <w:r/>
             <w:r>
               <w:rPr>
@@ -5079,6 +5470,9 @@
         </w:tc>
       </w:tr>
       <w:tr>
+        <w:trPr>
+          <w:cantSplit/>
+        </w:trPr>
         <w:tc>
           <w:tcPr>
             <w:tcW w:type="dxa" w:w="2665"/>
@@ -5090,6 +5484,9 @@
             </w:tcMar>
           </w:tcPr>
           <w:p>
+            <w:pPr>
+              <w:keepNext/>
+            </w:pPr>
             <w:r/>
             <w:r>
               <w:rPr>
@@ -5111,6 +5508,9 @@
             </w:tcMar>
           </w:tcPr>
           <w:p>
+            <w:pPr>
+              <w:keepNext/>
+            </w:pPr>
             <w:r/>
             <w:r>
               <w:rPr>
@@ -5132,6 +5532,9 @@
             </w:tcMar>
           </w:tcPr>
           <w:p>
+            <w:pPr>
+              <w:keepNext/>
+            </w:pPr>
             <w:r/>
             <w:r>
               <w:rPr>
@@ -5144,6 +5547,9 @@
         </w:tc>
       </w:tr>
       <w:tr>
+        <w:trPr>
+          <w:cantSplit/>
+        </w:trPr>
         <w:tc>
           <w:tcPr>
             <w:tcW w:type="dxa" w:w="2665"/>
@@ -5155,6 +5561,9 @@
             </w:tcMar>
           </w:tcPr>
           <w:p>
+            <w:pPr>
+              <w:keepNext/>
+            </w:pPr>
             <w:r/>
             <w:r>
               <w:rPr>
@@ -5176,6 +5585,9 @@
             </w:tcMar>
           </w:tcPr>
           <w:p>
+            <w:pPr>
+              <w:keepNext/>
+            </w:pPr>
             <w:r/>
             <w:r>
               <w:rPr>
@@ -5197,6 +5609,9 @@
             </w:tcMar>
           </w:tcPr>
           <w:p>
+            <w:pPr>
+              <w:keepNext/>
+            </w:pPr>
             <w:r/>
             <w:r>
               <w:rPr>
@@ -5209,6 +5624,9 @@
         </w:tc>
       </w:tr>
       <w:tr>
+        <w:trPr>
+          <w:cantSplit/>
+        </w:trPr>
         <w:tc>
           <w:tcPr>
             <w:tcW w:type="dxa" w:w="2665"/>
@@ -5220,6 +5638,9 @@
             </w:tcMar>
           </w:tcPr>
           <w:p>
+            <w:pPr>
+              <w:keepNext/>
+            </w:pPr>
             <w:r/>
             <w:r>
               <w:rPr>
@@ -5241,6 +5662,9 @@
             </w:tcMar>
           </w:tcPr>
           <w:p>
+            <w:pPr>
+              <w:keepNext/>
+            </w:pPr>
             <w:r/>
             <w:r>
               <w:rPr>
@@ -5262,6 +5686,9 @@
             </w:tcMar>
           </w:tcPr>
           <w:p>
+            <w:pPr>
+              <w:keepNext/>
+            </w:pPr>
             <w:r/>
             <w:r>
               <w:rPr>
@@ -5274,6 +5701,9 @@
         </w:tc>
       </w:tr>
       <w:tr>
+        <w:trPr>
+          <w:cantSplit/>
+        </w:trPr>
         <w:tc>
           <w:tcPr>
             <w:tcW w:type="dxa" w:w="2665"/>
@@ -5285,6 +5715,9 @@
             </w:tcMar>
           </w:tcPr>
           <w:p>
+            <w:pPr>
+              <w:keepNext/>
+            </w:pPr>
             <w:r/>
             <w:r>
               <w:rPr>
@@ -5306,6 +5739,9 @@
             </w:tcMar>
           </w:tcPr>
           <w:p>
+            <w:pPr>
+              <w:keepNext/>
+            </w:pPr>
             <w:r/>
             <w:r>
               <w:rPr>
@@ -5327,6 +5763,9 @@
             </w:tcMar>
           </w:tcPr>
           <w:p>
+            <w:pPr>
+              <w:keepNext/>
+            </w:pPr>
             <w:r/>
             <w:r>
               <w:rPr>
@@ -5339,6 +5778,9 @@
         </w:tc>
       </w:tr>
       <w:tr>
+        <w:trPr>
+          <w:cantSplit/>
+        </w:trPr>
         <w:tc>
           <w:tcPr>
             <w:tcW w:type="dxa" w:w="2665"/>
@@ -5350,6 +5792,9 @@
             </w:tcMar>
           </w:tcPr>
           <w:p>
+            <w:pPr>
+              <w:keepNext/>
+            </w:pPr>
             <w:r/>
             <w:r>
               <w:rPr>
@@ -5371,6 +5816,9 @@
             </w:tcMar>
           </w:tcPr>
           <w:p>
+            <w:pPr>
+              <w:keepNext/>
+            </w:pPr>
             <w:r/>
             <w:r>
               <w:rPr>
@@ -5392,6 +5840,9 @@
             </w:tcMar>
           </w:tcPr>
           <w:p>
+            <w:pPr>
+              <w:keepNext/>
+            </w:pPr>
             <w:r/>
             <w:r>
               <w:rPr>
@@ -5404,6 +5855,9 @@
         </w:tc>
       </w:tr>
       <w:tr>
+        <w:trPr>
+          <w:cantSplit/>
+        </w:trPr>
         <w:tc>
           <w:tcPr>
             <w:tcW w:type="dxa" w:w="2665"/>
@@ -5415,6 +5869,9 @@
             </w:tcMar>
           </w:tcPr>
           <w:p>
+            <w:pPr>
+              <w:keepNext/>
+            </w:pPr>
             <w:r/>
             <w:r>
               <w:rPr>
@@ -5436,6 +5893,9 @@
             </w:tcMar>
           </w:tcPr>
           <w:p>
+            <w:pPr>
+              <w:keepNext/>
+            </w:pPr>
             <w:r/>
             <w:r>
               <w:rPr>
@@ -5457,6 +5917,9 @@
             </w:tcMar>
           </w:tcPr>
           <w:p>
+            <w:pPr>
+              <w:keepNext/>
+            </w:pPr>
             <w:r/>
             <w:r>
               <w:rPr>
@@ -5469,6 +5932,9 @@
         </w:tc>
       </w:tr>
       <w:tr>
+        <w:trPr>
+          <w:cantSplit/>
+        </w:trPr>
         <w:tc>
           <w:tcPr>
             <w:tcW w:type="dxa" w:w="2665"/>
@@ -5587,11 +6053,6 @@
       </w:r>
     </w:p>
     <w:p>
-      <w:r>
-        <w:br w:type="page"/>
-      </w:r>
-    </w:p>
-    <w:p>
       <w:pPr>
         <w:pStyle w:val="Heading1"/>
       </w:pPr>
@@ -5637,6 +6098,10 @@
         <w:gridCol w:w="3137"/>
       </w:tblGrid>
       <w:tr>
+        <w:trPr>
+          <w:cantSplit/>
+          <w:tblHeader/>
+        </w:trPr>
         <w:tc>
           <w:tcPr>
             <w:tcW w:type="dxa" w:w="907"/>
@@ -5649,6 +6114,9 @@
             </w:tcMar>
           </w:tcPr>
           <w:p>
+            <w:pPr>
+              <w:keepNext/>
+            </w:pPr>
             <w:r/>
             <w:r>
               <w:rPr>
@@ -5673,6 +6141,9 @@
             </w:tcMar>
           </w:tcPr>
           <w:p>
+            <w:pPr>
+              <w:keepNext/>
+            </w:pPr>
             <w:r/>
             <w:r>
               <w:rPr>
@@ -5697,6 +6168,9 @@
             </w:tcMar>
           </w:tcPr>
           <w:p>
+            <w:pPr>
+              <w:keepNext/>
+            </w:pPr>
             <w:r/>
             <w:r>
               <w:rPr>
@@ -5711,6 +6185,9 @@
         </w:tc>
       </w:tr>
       <w:tr>
+        <w:trPr>
+          <w:cantSplit/>
+        </w:trPr>
         <w:tc>
           <w:tcPr>
             <w:tcW w:type="dxa" w:w="907"/>
@@ -5722,6 +6199,9 @@
             </w:tcMar>
           </w:tcPr>
           <w:p>
+            <w:pPr>
+              <w:keepNext/>
+            </w:pPr>
             <w:r/>
             <w:r>
               <w:rPr>
@@ -5743,6 +6223,9 @@
             </w:tcMar>
           </w:tcPr>
           <w:p>
+            <w:pPr>
+              <w:keepNext/>
+            </w:pPr>
             <w:r/>
             <w:r>
               <w:rPr>
@@ -5764,6 +6247,9 @@
             </w:tcMar>
           </w:tcPr>
           <w:p>
+            <w:pPr>
+              <w:keepNext/>
+            </w:pPr>
             <w:r/>
             <w:r>
               <w:rPr>
@@ -5776,6 +6262,9 @@
         </w:tc>
       </w:tr>
       <w:tr>
+        <w:trPr>
+          <w:cantSplit/>
+        </w:trPr>
         <w:tc>
           <w:tcPr>
             <w:tcW w:type="dxa" w:w="907"/>
@@ -5787,6 +6276,9 @@
             </w:tcMar>
           </w:tcPr>
           <w:p>
+            <w:pPr>
+              <w:keepNext/>
+            </w:pPr>
             <w:r/>
             <w:r>
               <w:rPr>
@@ -5808,6 +6300,9 @@
             </w:tcMar>
           </w:tcPr>
           <w:p>
+            <w:pPr>
+              <w:keepNext/>
+            </w:pPr>
             <w:r/>
             <w:r>
               <w:rPr>
@@ -5829,6 +6324,9 @@
             </w:tcMar>
           </w:tcPr>
           <w:p>
+            <w:pPr>
+              <w:keepNext/>
+            </w:pPr>
             <w:r/>
             <w:r>
               <w:rPr>
@@ -5841,6 +6339,9 @@
         </w:tc>
       </w:tr>
       <w:tr>
+        <w:trPr>
+          <w:cantSplit/>
+        </w:trPr>
         <w:tc>
           <w:tcPr>
             <w:tcW w:type="dxa" w:w="907"/>
@@ -5852,6 +6353,9 @@
             </w:tcMar>
           </w:tcPr>
           <w:p>
+            <w:pPr>
+              <w:keepNext/>
+            </w:pPr>
             <w:r/>
             <w:r>
               <w:rPr>
@@ -5873,6 +6377,9 @@
             </w:tcMar>
           </w:tcPr>
           <w:p>
+            <w:pPr>
+              <w:keepNext/>
+            </w:pPr>
             <w:r/>
             <w:r>
               <w:rPr>
@@ -5894,6 +6401,9 @@
             </w:tcMar>
           </w:tcPr>
           <w:p>
+            <w:pPr>
+              <w:keepNext/>
+            </w:pPr>
             <w:r/>
             <w:r>
               <w:rPr>
@@ -5906,6 +6416,9 @@
         </w:tc>
       </w:tr>
       <w:tr>
+        <w:trPr>
+          <w:cantSplit/>
+        </w:trPr>
         <w:tc>
           <w:tcPr>
             <w:tcW w:type="dxa" w:w="907"/>
@@ -5917,6 +6430,9 @@
             </w:tcMar>
           </w:tcPr>
           <w:p>
+            <w:pPr>
+              <w:keepNext/>
+            </w:pPr>
             <w:r/>
             <w:r>
               <w:rPr>
@@ -5938,6 +6454,9 @@
             </w:tcMar>
           </w:tcPr>
           <w:p>
+            <w:pPr>
+              <w:keepNext/>
+            </w:pPr>
             <w:r/>
             <w:r>
               <w:rPr>
@@ -5959,6 +6478,9 @@
             </w:tcMar>
           </w:tcPr>
           <w:p>
+            <w:pPr>
+              <w:keepNext/>
+            </w:pPr>
             <w:r/>
             <w:r>
               <w:rPr>
@@ -5971,6 +6493,9 @@
         </w:tc>
       </w:tr>
       <w:tr>
+        <w:trPr>
+          <w:cantSplit/>
+        </w:trPr>
         <w:tc>
           <w:tcPr>
             <w:tcW w:type="dxa" w:w="907"/>
@@ -5982,6 +6507,9 @@
             </w:tcMar>
           </w:tcPr>
           <w:p>
+            <w:pPr>
+              <w:keepNext/>
+            </w:pPr>
             <w:r/>
             <w:r>
               <w:rPr>
@@ -6003,6 +6531,9 @@
             </w:tcMar>
           </w:tcPr>
           <w:p>
+            <w:pPr>
+              <w:keepNext/>
+            </w:pPr>
             <w:r/>
             <w:r>
               <w:rPr>
@@ -6024,6 +6555,9 @@
             </w:tcMar>
           </w:tcPr>
           <w:p>
+            <w:pPr>
+              <w:keepNext/>
+            </w:pPr>
             <w:r/>
             <w:r>
               <w:rPr>
@@ -6036,6 +6570,9 @@
         </w:tc>
       </w:tr>
       <w:tr>
+        <w:trPr>
+          <w:cantSplit/>
+        </w:trPr>
         <w:tc>
           <w:tcPr>
             <w:tcW w:type="dxa" w:w="907"/>
@@ -6047,6 +6584,9 @@
             </w:tcMar>
           </w:tcPr>
           <w:p>
+            <w:pPr>
+              <w:keepNext/>
+            </w:pPr>
             <w:r/>
             <w:r>
               <w:rPr>
@@ -6068,6 +6608,9 @@
             </w:tcMar>
           </w:tcPr>
           <w:p>
+            <w:pPr>
+              <w:keepNext/>
+            </w:pPr>
             <w:r/>
             <w:r>
               <w:rPr>
@@ -6089,6 +6632,9 @@
             </w:tcMar>
           </w:tcPr>
           <w:p>
+            <w:pPr>
+              <w:keepNext/>
+            </w:pPr>
             <w:r/>
             <w:r>
               <w:rPr>
@@ -6101,6 +6647,9 @@
         </w:tc>
       </w:tr>
       <w:tr>
+        <w:trPr>
+          <w:cantSplit/>
+        </w:trPr>
         <w:tc>
           <w:tcPr>
             <w:tcW w:type="dxa" w:w="907"/>
@@ -6196,6 +6745,10 @@
         <w:gridCol w:w="3137"/>
       </w:tblGrid>
       <w:tr>
+        <w:trPr>
+          <w:cantSplit/>
+          <w:tblHeader/>
+        </w:trPr>
         <w:tc>
           <w:tcPr>
             <w:tcW w:type="dxa" w:w="1928"/>
@@ -6208,6 +6761,9 @@
             </w:tcMar>
           </w:tcPr>
           <w:p>
+            <w:pPr>
+              <w:keepNext/>
+            </w:pPr>
             <w:r/>
             <w:r>
               <w:rPr>
@@ -6232,6 +6788,9 @@
             </w:tcMar>
           </w:tcPr>
           <w:p>
+            <w:pPr>
+              <w:keepNext/>
+            </w:pPr>
             <w:r/>
             <w:r>
               <w:rPr>
@@ -6256,6 +6815,9 @@
             </w:tcMar>
           </w:tcPr>
           <w:p>
+            <w:pPr>
+              <w:keepNext/>
+            </w:pPr>
             <w:r/>
             <w:r>
               <w:rPr>
@@ -6270,6 +6832,9 @@
         </w:tc>
       </w:tr>
       <w:tr>
+        <w:trPr>
+          <w:cantSplit/>
+        </w:trPr>
         <w:tc>
           <w:tcPr>
             <w:tcW w:type="dxa" w:w="1928"/>
@@ -6281,6 +6846,9 @@
             </w:tcMar>
           </w:tcPr>
           <w:p>
+            <w:pPr>
+              <w:keepNext/>
+            </w:pPr>
             <w:r/>
             <w:r>
               <w:rPr>
@@ -6302,6 +6870,9 @@
             </w:tcMar>
           </w:tcPr>
           <w:p>
+            <w:pPr>
+              <w:keepNext/>
+            </w:pPr>
             <w:r/>
             <w:r>
               <w:rPr>
@@ -6323,6 +6894,9 @@
             </w:tcMar>
           </w:tcPr>
           <w:p>
+            <w:pPr>
+              <w:keepNext/>
+            </w:pPr>
             <w:r/>
             <w:r>
               <w:rPr>
@@ -6335,6 +6909,9 @@
         </w:tc>
       </w:tr>
       <w:tr>
+        <w:trPr>
+          <w:cantSplit/>
+        </w:trPr>
         <w:tc>
           <w:tcPr>
             <w:tcW w:type="dxa" w:w="1928"/>
@@ -6346,6 +6923,9 @@
             </w:tcMar>
           </w:tcPr>
           <w:p>
+            <w:pPr>
+              <w:keepNext/>
+            </w:pPr>
             <w:r/>
             <w:r>
               <w:rPr>
@@ -6367,6 +6947,9 @@
             </w:tcMar>
           </w:tcPr>
           <w:p>
+            <w:pPr>
+              <w:keepNext/>
+            </w:pPr>
             <w:r/>
             <w:r>
               <w:rPr>
@@ -6388,6 +6971,9 @@
             </w:tcMar>
           </w:tcPr>
           <w:p>
+            <w:pPr>
+              <w:keepNext/>
+            </w:pPr>
             <w:r/>
             <w:r>
               <w:rPr>
@@ -6400,6 +6986,9 @@
         </w:tc>
       </w:tr>
       <w:tr>
+        <w:trPr>
+          <w:cantSplit/>
+        </w:trPr>
         <w:tc>
           <w:tcPr>
             <w:tcW w:type="dxa" w:w="1928"/>
@@ -6411,6 +7000,9 @@
             </w:tcMar>
           </w:tcPr>
           <w:p>
+            <w:pPr>
+              <w:keepNext/>
+            </w:pPr>
             <w:r/>
             <w:r>
               <w:rPr>
@@ -6432,6 +7024,9 @@
             </w:tcMar>
           </w:tcPr>
           <w:p>
+            <w:pPr>
+              <w:keepNext/>
+            </w:pPr>
             <w:r/>
             <w:r>
               <w:rPr>
@@ -6453,6 +7048,9 @@
             </w:tcMar>
           </w:tcPr>
           <w:p>
+            <w:pPr>
+              <w:keepNext/>
+            </w:pPr>
             <w:r/>
             <w:r>
               <w:rPr>
@@ -6465,6 +7063,9 @@
         </w:tc>
       </w:tr>
       <w:tr>
+        <w:trPr>
+          <w:cantSplit/>
+        </w:trPr>
         <w:tc>
           <w:tcPr>
             <w:tcW w:type="dxa" w:w="1928"/>
@@ -6540,35 +7141,38 @@
     </w:p>
     <w:p>
       <w:pPr>
-        <w:pStyle w:val="ListNumber"/>
+        <w:spacing w:after="60"/>
+        <w:ind w:left="425" w:hanging="369"/>
       </w:pPr>
       <w:r>
         <w:rPr>
           <w:rFonts w:ascii="Microsoft YaHei" w:hAnsi="Microsoft YaHei" w:eastAsia="Microsoft YaHei"/>
         </w:rPr>
-        <w:t>0—30 分钟：单词，先猜意思，再中译英/造句。</w:t>
+        <w:t>1. 0—30 分钟：单词，先猜意思，再中译英/造句。</w:t>
       </w:r>
     </w:p>
     <w:p>
       <w:pPr>
-        <w:pStyle w:val="ListNumber"/>
+        <w:spacing w:after="60"/>
+        <w:ind w:left="425" w:hanging="369"/>
       </w:pPr>
       <w:r>
         <w:rPr>
           <w:rFonts w:ascii="Microsoft YaHei" w:hAnsi="Microsoft YaHei" w:eastAsia="Microsoft YaHei"/>
         </w:rPr>
-        <w:t>30—60 分钟：20 题，先选答案，再用一句话说理由。</w:t>
+        <w:t>2. 30—60 分钟：20 题，先选答案，再用一句话说理由。</w:t>
       </w:r>
     </w:p>
     <w:p>
       <w:pPr>
-        <w:pStyle w:val="ListNumber"/>
+        <w:spacing w:after="60"/>
+        <w:ind w:left="425" w:hanging="369"/>
       </w:pPr>
       <w:r>
         <w:rPr>
           <w:rFonts w:ascii="Microsoft YaHei" w:hAnsi="Microsoft YaHei" w:eastAsia="Microsoft YaHei"/>
         </w:rPr>
-        <w:t>最后 2 分钟：记一个下次动作；不抄答案。</w:t>
+        <w:t>3. 最后 2 分钟：记一个下次动作；不抄答案。</w:t>
       </w:r>
     </w:p>
     <w:p>
@@ -6595,11 +7199,6 @@
           <w:b w:val="0"/>
         </w:rPr>
         <w:t>写作 30 分钟 → 听力 25 分钟 → 仔细阅读 25—30 分钟 → 翻译 20—25 分钟 → 长篇匹配 8—10 分钟 → 选词填空 5—7 分钟（不够就猜）。</w:t>
-      </w:r>
-    </w:p>
-    <w:p>
-      <w:r>
-        <w:br w:type="page"/>
       </w:r>
     </w:p>
     <w:p>
@@ -6715,6 +7314,10 @@
         <w:gridCol w:w="3137"/>
       </w:tblGrid>
       <w:tr>
+        <w:trPr>
+          <w:cantSplit/>
+          <w:tblHeader/>
+        </w:trPr>
         <w:tc>
           <w:tcPr>
             <w:tcW w:type="dxa" w:w="2381"/>
@@ -6727,6 +7330,9 @@
             </w:tcMar>
           </w:tcPr>
           <w:p>
+            <w:pPr>
+              <w:keepNext/>
+            </w:pPr>
             <w:r/>
             <w:r>
               <w:rPr>
@@ -6751,6 +7357,9 @@
             </w:tcMar>
           </w:tcPr>
           <w:p>
+            <w:pPr>
+              <w:keepNext/>
+            </w:pPr>
             <w:r/>
             <w:r>
               <w:rPr>
@@ -6775,6 +7384,9 @@
             </w:tcMar>
           </w:tcPr>
           <w:p>
+            <w:pPr>
+              <w:keepNext/>
+            </w:pPr>
             <w:r/>
             <w:r>
               <w:rPr>
@@ -6789,6 +7401,9 @@
         </w:tc>
       </w:tr>
       <w:tr>
+        <w:trPr>
+          <w:cantSplit/>
+        </w:trPr>
         <w:tc>
           <w:tcPr>
             <w:tcW w:type="dxa" w:w="2381"/>
@@ -6800,6 +7415,9 @@
             </w:tcMar>
           </w:tcPr>
           <w:p>
+            <w:pPr>
+              <w:keepNext/>
+            </w:pPr>
             <w:r/>
             <w:r>
               <w:rPr>
@@ -6821,6 +7439,9 @@
             </w:tcMar>
           </w:tcPr>
           <w:p>
+            <w:pPr>
+              <w:keepNext/>
+            </w:pPr>
             <w:r/>
             <w:r>
               <w:rPr>
@@ -6842,6 +7463,9 @@
             </w:tcMar>
           </w:tcPr>
           <w:p>
+            <w:pPr>
+              <w:keepNext/>
+            </w:pPr>
             <w:r/>
             <w:r>
               <w:rPr>
@@ -6854,6 +7478,9 @@
         </w:tc>
       </w:tr>
       <w:tr>
+        <w:trPr>
+          <w:cantSplit/>
+        </w:trPr>
         <w:tc>
           <w:tcPr>
             <w:tcW w:type="dxa" w:w="2381"/>
@@ -6865,6 +7492,9 @@
             </w:tcMar>
           </w:tcPr>
           <w:p>
+            <w:pPr>
+              <w:keepNext/>
+            </w:pPr>
             <w:r/>
             <w:r>
               <w:rPr>
@@ -6886,6 +7516,9 @@
             </w:tcMar>
           </w:tcPr>
           <w:p>
+            <w:pPr>
+              <w:keepNext/>
+            </w:pPr>
             <w:r/>
             <w:r>
               <w:rPr>
@@ -6907,6 +7540,9 @@
             </w:tcMar>
           </w:tcPr>
           <w:p>
+            <w:pPr>
+              <w:keepNext/>
+            </w:pPr>
             <w:r/>
             <w:r>
               <w:rPr>
@@ -6919,6 +7555,9 @@
         </w:tc>
       </w:tr>
       <w:tr>
+        <w:trPr>
+          <w:cantSplit/>
+        </w:trPr>
         <w:tc>
           <w:tcPr>
             <w:tcW w:type="dxa" w:w="2381"/>
@@ -6930,6 +7569,9 @@
             </w:tcMar>
           </w:tcPr>
           <w:p>
+            <w:pPr>
+              <w:keepNext/>
+            </w:pPr>
             <w:r/>
             <w:r>
               <w:rPr>
@@ -6951,6 +7593,9 @@
             </w:tcMar>
           </w:tcPr>
           <w:p>
+            <w:pPr>
+              <w:keepNext/>
+            </w:pPr>
             <w:r/>
             <w:r>
               <w:rPr>
@@ -6972,6 +7617,9 @@
             </w:tcMar>
           </w:tcPr>
           <w:p>
+            <w:pPr>
+              <w:keepNext/>
+            </w:pPr>
             <w:r/>
             <w:r>
               <w:rPr>
@@ -6984,6 +7632,9 @@
         </w:tc>
       </w:tr>
       <w:tr>
+        <w:trPr>
+          <w:cantSplit/>
+        </w:trPr>
         <w:tc>
           <w:tcPr>
             <w:tcW w:type="dxa" w:w="2381"/>
@@ -7171,11 +7822,6 @@
       </w:r>
     </w:p>
     <w:p>
-      <w:r>
-        <w:br w:type="page"/>
-      </w:r>
-    </w:p>
-    <w:p>
       <w:pPr>
         <w:pStyle w:val="Heading1"/>
       </w:pPr>
@@ -7258,11 +7904,6 @@
           <w:b w:val="0"/>
         </w:rPr>
         <w:t>每天默认最多 60 次调用。缓存和本地判断会减少调用。没有 Key 或预算用完时，学习流程不阻塞。</w:t>
-      </w:r>
-    </w:p>
-    <w:p>
-      <w:r>
-        <w:br w:type="page"/>
       </w:r>
     </w:p>
     <w:p>
@@ -7343,6 +7984,10 @@
         <w:gridCol w:w="4706"/>
       </w:tblGrid>
       <w:tr>
+        <w:trPr>
+          <w:cantSplit/>
+          <w:tblHeader/>
+        </w:trPr>
         <w:tc>
           <w:tcPr>
             <w:tcW w:type="dxa" w:w="5102"/>
@@ -7355,6 +8000,9 @@
             </w:tcMar>
           </w:tcPr>
           <w:p>
+            <w:pPr>
+              <w:keepNext/>
+            </w:pPr>
             <w:r/>
             <w:r>
               <w:rPr>
@@ -7379,6 +8027,9 @@
             </w:tcMar>
           </w:tcPr>
           <w:p>
+            <w:pPr>
+              <w:keepNext/>
+            </w:pPr>
             <w:r/>
             <w:r>
               <w:rPr>
@@ -7393,6 +8044,9 @@
         </w:tc>
       </w:tr>
       <w:tr>
+        <w:trPr>
+          <w:cantSplit/>
+        </w:trPr>
         <w:tc>
           <w:tcPr>
             <w:tcW w:type="dxa" w:w="5102"/>
@@ -7404,6 +8058,9 @@
             </w:tcMar>
           </w:tcPr>
           <w:p>
+            <w:pPr>
+              <w:keepNext/>
+            </w:pPr>
             <w:r/>
             <w:r>
               <w:rPr>
@@ -7425,6 +8082,9 @@
             </w:tcMar>
           </w:tcPr>
           <w:p>
+            <w:pPr>
+              <w:keepNext/>
+            </w:pPr>
             <w:r/>
             <w:r>
               <w:rPr>
@@ -7437,6 +8097,9 @@
         </w:tc>
       </w:tr>
       <w:tr>
+        <w:trPr>
+          <w:cantSplit/>
+        </w:trPr>
         <w:tc>
           <w:tcPr>
             <w:tcW w:type="dxa" w:w="5102"/>
@@ -7448,6 +8111,9 @@
             </w:tcMar>
           </w:tcPr>
           <w:p>
+            <w:pPr>
+              <w:keepNext/>
+            </w:pPr>
             <w:r/>
             <w:r>
               <w:rPr>
@@ -7469,6 +8135,9 @@
             </w:tcMar>
           </w:tcPr>
           <w:p>
+            <w:pPr>
+              <w:keepNext/>
+            </w:pPr>
             <w:r/>
             <w:r>
               <w:rPr>
@@ -7481,6 +8150,9 @@
         </w:tc>
       </w:tr>
       <w:tr>
+        <w:trPr>
+          <w:cantSplit/>
+        </w:trPr>
         <w:tc>
           <w:tcPr>
             <w:tcW w:type="dxa" w:w="5102"/>
@@ -7492,6 +8164,9 @@
             </w:tcMar>
           </w:tcPr>
           <w:p>
+            <w:pPr>
+              <w:keepNext/>
+            </w:pPr>
             <w:r/>
             <w:r>
               <w:rPr>
@@ -7513,6 +8188,9 @@
             </w:tcMar>
           </w:tcPr>
           <w:p>
+            <w:pPr>
+              <w:keepNext/>
+            </w:pPr>
             <w:r/>
             <w:r>
               <w:rPr>
@@ -7525,6 +8203,9 @@
         </w:tc>
       </w:tr>
       <w:tr>
+        <w:trPr>
+          <w:cantSplit/>
+        </w:trPr>
         <w:tc>
           <w:tcPr>
             <w:tcW w:type="dxa" w:w="5102"/>
@@ -7536,6 +8217,9 @@
             </w:tcMar>
           </w:tcPr>
           <w:p>
+            <w:pPr>
+              <w:keepNext/>
+            </w:pPr>
             <w:r/>
             <w:r>
               <w:rPr>
@@ -7557,6 +8241,9 @@
             </w:tcMar>
           </w:tcPr>
           <w:p>
+            <w:pPr>
+              <w:keepNext/>
+            </w:pPr>
             <w:r/>
             <w:r>
               <w:rPr>
@@ -7569,6 +8256,9 @@
         </w:tc>
       </w:tr>
       <w:tr>
+        <w:trPr>
+          <w:cantSplit/>
+        </w:trPr>
         <w:tc>
           <w:tcPr>
             <w:tcW w:type="dxa" w:w="5102"/>
@@ -7580,6 +8270,9 @@
             </w:tcMar>
           </w:tcPr>
           <w:p>
+            <w:pPr>
+              <w:keepNext/>
+            </w:pPr>
             <w:r/>
             <w:r>
               <w:rPr>
@@ -7601,6 +8294,9 @@
             </w:tcMar>
           </w:tcPr>
           <w:p>
+            <w:pPr>
+              <w:keepNext/>
+            </w:pPr>
             <w:r/>
             <w:r>
               <w:rPr>
@@ -7613,6 +8309,9 @@
         </w:tc>
       </w:tr>
       <w:tr>
+        <w:trPr>
+          <w:cantSplit/>
+        </w:trPr>
         <w:tc>
           <w:tcPr>
             <w:tcW w:type="dxa" w:w="5102"/>
@@ -7624,6 +8323,9 @@
             </w:tcMar>
           </w:tcPr>
           <w:p>
+            <w:pPr>
+              <w:keepNext/>
+            </w:pPr>
             <w:r/>
             <w:r>
               <w:rPr>
@@ -7645,6 +8347,9 @@
             </w:tcMar>
           </w:tcPr>
           <w:p>
+            <w:pPr>
+              <w:keepNext/>
+            </w:pPr>
             <w:r/>
             <w:r>
               <w:rPr>
@@ -7657,6 +8362,9 @@
         </w:tc>
       </w:tr>
       <w:tr>
+        <w:trPr>
+          <w:cantSplit/>
+        </w:trPr>
         <w:tc>
           <w:tcPr>
             <w:tcW w:type="dxa" w:w="5102"/>

</xml_diff>

<commit_message>
v1.1.0: UI hierarchy, scroll reset, shuffled options, deep explanations, local history
</commit_message>
<xml_diff>
--- a/docs/CET4Coach-User-Manual.zh-CN.docx
+++ b/docs/CET4Coach-User-Manual.zh-CN.docx
@@ -74,7 +74,7 @@
           <w:color w:val="5F6E67"/>
           <w:sz w:val="20"/>
         </w:rPr>
-        <w:t>版本 1.0  ·  2026 年 10 月</w:t>
+        <w:t>版本 1.1  ·  2026 年 10 月</w:t>
       </w:r>
     </w:p>
     <w:p/>
@@ -2561,6 +2561,32 @@
     </w:p>
     <w:p>
       <w:pPr>
+        <w:pStyle w:val="Heading2"/>
+      </w:pPr>
+      <w:r>
+        <w:t>4.4 窗口、字号和滚动</w:t>
+      </w:r>
+    </w:p>
+    <w:p>
+      <w:r>
+        <w:rPr>
+          <w:rFonts w:ascii="Microsoft YaHei" w:hAnsi="Microsoft YaHei" w:eastAsia="Microsoft YaHei"/>
+          <w:b w:val="0"/>
+        </w:rPr>
+        <w:t>默认窗口约 1400×940，并会自动限制在当前屏幕工作区内。页面标题 30pt、卡片标题 21pt、正文 15—18pt、注释 12—14pt；标题和正文不再一个大小。</w:t>
+      </w:r>
+    </w:p>
+    <w:p>
+      <w:r>
+        <w:rPr>
+          <w:rFonts w:ascii="Microsoft YaHei" w:hAnsi="Microsoft YaHei" w:eastAsia="Microsoft YaHei"/>
+          <w:b w:val="0"/>
+        </w:rPr>
+        <w:t>翻页、下一题、提交反馈后会自动回到内容顶部；内容比窗口高时用右侧滚动条。若屏幕较小，窗口会缩小，文字会自动换行而不是互相盖住。</w:t>
+      </w:r>
+    </w:p>
+    <w:p>
+      <w:pPr>
         <w:pStyle w:val="Heading1"/>
       </w:pPr>
       <w:r>
@@ -3535,6 +3561,67 @@
           <w:b w:val="0"/>
         </w:rPr>
         <w:t>程序只从当天临时工作区播放；没有临时音频就按“缺音频”提示，不会偷偷拿源库文件。只关闭本系统启动的 PotPlayer 进程，不会强制关闭你自己的播放器。</w:t>
+      </w:r>
+    </w:p>
+    <w:p>
+      <w:pPr>
+        <w:pStyle w:val="Heading2"/>
+      </w:pPr>
+      <w:r>
+        <w:t>6.7 第二次做错题：选项打乱与跳过重复</w:t>
+      </w:r>
+    </w:p>
+    <w:p>
+      <w:r>
+        <w:rPr>
+          <w:rFonts w:ascii="Microsoft YaHei" w:hAnsi="Microsoft YaHei" w:eastAsia="Microsoft YaHei"/>
+          <w:b w:val="0"/>
+        </w:rPr>
+        <w:t>同一道单选题第一次答错后，下一次再出现时，A/B/C/D 的顺序会自动打乱，正确答案也会映射到新的字母。页面会明确提示“这次选项已打乱”，并在题干上方显示：上次你选了什么、上次错误类型是什么。</w:t>
+      </w:r>
+    </w:p>
+    <w:p>
+      <w:r>
+        <w:rPr>
+          <w:rFonts w:ascii="Microsoft YaHei" w:hAnsi="Microsoft YaHei" w:eastAsia="Microsoft YaHei"/>
+          <w:b w:val="0"/>
+        </w:rPr>
+        <w:t>不要背上次的字母。先看题干问什么，再回原文/录音定位，最后按内容选。选项打乱只针对 4 个选项的单选题；匹配题和选词填空的选项是段落/词库标签，保持原顺序。</w:t>
+      </w:r>
+    </w:p>
+    <w:p>
+      <w:r>
+        <w:rPr>
+          <w:rFonts w:ascii="Microsoft YaHei" w:hAnsi="Microsoft YaHei" w:eastAsia="Microsoft YaHei"/>
+          <w:b w:val="0"/>
+        </w:rPr>
+        <w:t>一道题完成两次学习后，题目页会出现“这题已学习两遍”的勾选框。默认勾选，提交后直接读已保存的讲解要点，不再重复调用深度讲解；想重新生成，取消勾选即可。反馈页也会出现“跳过重复内容”按钮。</w:t>
+      </w:r>
+    </w:p>
+    <w:p>
+      <w:pPr>
+        <w:pStyle w:val="Heading2"/>
+      </w:pPr>
+      <w:r>
+        <w:t>6.8 每轮学习保存到哪里</w:t>
+      </w:r>
+    </w:p>
+    <w:p>
+      <w:r>
+        <w:rPr>
+          <w:rFonts w:ascii="Microsoft YaHei" w:hAnsi="Microsoft YaHei" w:eastAsia="Microsoft YaHei"/>
+          <w:b w:val="0"/>
+        </w:rPr>
+        <w:t>每轮单词/刷题完成后，完整记录写入 data/history/；文件名带日期和时间，另有 latest-quiz.json / latest-word.json。内容包括题目、选项、你的答案、理由、对错、错误类型、讲解来源。中途退出仍保存在 data/sessions/，下次继续。</w:t>
+      </w:r>
+    </w:p>
+    <w:p>
+      <w:r>
+        <w:rPr>
+          <w:rFonts w:ascii="Microsoft YaHei" w:hAnsi="Microsoft YaHei" w:eastAsia="Microsoft YaHei"/>
+          <w:b w:val="0"/>
+        </w:rPr>
+        <w:t>下一轮选题会优先重出错题本里的活跃错题，并在题目页强调上次的错误；这就是“第二次学习按上次错误复习”的来源。</w:t>
       </w:r>
     </w:p>
     <w:p>
@@ -3942,7 +4029,77 @@
         <w:pStyle w:val="Heading2"/>
       </w:pPr>
       <w:r>
-        <w:t>7.2 讲解会缓存</w:t>
+        <w:t>7.2 深度讲解会做什么</w:t>
+      </w:r>
+    </w:p>
+    <w:p>
+      <w:r>
+        <w:rPr>
+          <w:rFonts w:ascii="Microsoft YaHei" w:hAnsi="Microsoft YaHei" w:eastAsia="Microsoft YaHei"/>
+          <w:b w:val="0"/>
+        </w:rPr>
+        <w:t>错题会调用 DeepSeek 做一次针对本题的诊断，而不是只给一段通用解析。它会：</w:t>
+      </w:r>
+    </w:p>
+    <w:p>
+      <w:pPr>
+        <w:pStyle w:val="ListBullet"/>
+      </w:pPr>
+      <w:r>
+        <w:rPr>
+          <w:rFonts w:ascii="Microsoft YaHei" w:hAnsi="Microsoft YaHei" w:eastAsia="Microsoft YaHei"/>
+        </w:rPr>
+        <w:t>先判断这道题具体考什么，再引用原文/录音的定位句或信号词。</w:t>
+      </w:r>
+    </w:p>
+    <w:p>
+      <w:pPr>
+        <w:pStyle w:val="ListBullet"/>
+      </w:pPr>
+      <w:r>
+        <w:rPr>
+          <w:rFonts w:ascii="Microsoft YaHei" w:hAnsi="Microsoft YaHei" w:eastAsia="Microsoft YaHei"/>
+        </w:rPr>
+        <w:t>根据你选的选项和理由，推断你为什么被它吸引；不确定时会写“从你的选择看，可能……”。</w:t>
+      </w:r>
+    </w:p>
+    <w:p>
+      <w:pPr>
+        <w:pStyle w:val="ListBullet"/>
+      </w:pPr>
+      <w:r>
+        <w:rPr>
+          <w:rFonts w:ascii="Microsoft YaHei" w:hAnsi="Microsoft YaHei" w:eastAsia="Microsoft YaHei"/>
+        </w:rPr>
+        <w:t>逐项分析 A/B/C/D 每个选项：正确项为什么对，干扰项偷换了什么，无关项为什么答非所问。</w:t>
+      </w:r>
+    </w:p>
+    <w:p>
+      <w:pPr>
+        <w:pStyle w:val="ListBullet"/>
+      </w:pPr>
+      <w:r>
+        <w:rPr>
+          <w:rFonts w:ascii="Microsoft YaHei" w:hAnsi="Microsoft YaHei" w:eastAsia="Microsoft YaHei"/>
+        </w:rPr>
+        <w:t>给出下次遇到同类题的一个动作、一条技巧依据，以及 2 个自测追问。</w:t>
+      </w:r>
+    </w:p>
+    <w:p>
+      <w:r>
+        <w:rPr>
+          <w:rFonts w:ascii="Microsoft YaHei" w:hAnsi="Microsoft YaHei" w:eastAsia="Microsoft YaHei"/>
+          <w:b w:val="0"/>
+        </w:rPr>
+        <w:t>默认模型是 deepseek-chat，最多 2400 输出 token；可在 config.json 的 llm.explanationModel 换成你的账号支持的更深模型。没有 API Key 时会明确显示“本地解析”，不会把本地模板说成联网深度讲解。</w:t>
+      </w:r>
+    </w:p>
+    <w:p>
+      <w:pPr>
+        <w:pStyle w:val="Heading2"/>
+      </w:pPr>
+      <w:r>
+        <w:t>7.3 讲解会缓存</w:t>
       </w:r>
     </w:p>
     <w:p>
@@ -3968,7 +4125,7 @@
         <w:pStyle w:val="Heading2"/>
       </w:pPr>
       <w:r>
-        <w:t>7.3 怎么看错题最有效</w:t>
+        <w:t>7.4 怎么看错题最有效</w:t>
       </w:r>
     </w:p>
     <w:p>
@@ -4029,6 +4186,23 @@
           <w:rFonts w:ascii="Microsoft YaHei" w:hAnsi="Microsoft YaHei" w:eastAsia="Microsoft YaHei"/>
         </w:rPr>
         <w:t>5. 隔天再做一次；如果只是记住答案，不算掌握。</w:t>
+      </w:r>
+    </w:p>
+    <w:p>
+      <w:pPr>
+        <w:pStyle w:val="Heading2"/>
+      </w:pPr>
+      <w:r>
+        <w:t>7.5 什么时候可以跳过重复内容</w:t>
+      </w:r>
+    </w:p>
+    <w:p>
+      <w:r>
+        <w:rPr>
+          <w:rFonts w:ascii="Microsoft YaHei" w:hAnsi="Microsoft YaHei" w:eastAsia="Microsoft YaHei"/>
+          <w:b w:val="0"/>
+        </w:rPr>
+        <w:t>同一道错题完成两次学习后，系统会记录 learnedTwice。下一次遇到它时，题目页会出现“这题已学习两遍，跳过重复逐项讲解”的勾选框，默认勾选；提交后直接读保存的要点，不再调用深度讲解。反馈页仍有“跳过重复内容”按钮，想重新生成就取消勾选。</w:t>
       </w:r>
     </w:p>
     <w:tbl>
@@ -5878,6 +6052,83 @@
                 <w:rFonts w:ascii="Microsoft YaHei" w:hAnsi="Microsoft YaHei" w:eastAsia="Microsoft YaHei"/>
                 <w:sz w:val="18"/>
               </w:rPr>
+              <w:t>data/history/</w:t>
+            </w:r>
+          </w:p>
+        </w:tc>
+        <w:tc>
+          <w:tcPr>
+            <w:tcW w:type="dxa" w:w="4309"/>
+            <w:tcMar>
+              <w:top w:w="70" w:type="dxa"/>
+              <w:start w:w="100" w:type="dxa"/>
+              <w:bottom w:w="70" w:type="dxa"/>
+              <w:end w:w="100" w:type="dxa"/>
+            </w:tcMar>
+          </w:tcPr>
+          <w:p>
+            <w:pPr>
+              <w:keepNext/>
+            </w:pPr>
+            <w:r/>
+            <w:r>
+              <w:rPr>
+                <w:rFonts w:ascii="Microsoft YaHei" w:hAnsi="Microsoft YaHei" w:eastAsia="Microsoft YaHei"/>
+                <w:sz w:val="18"/>
+              </w:rPr>
+              <w:t>每轮完整学习档案</w:t>
+            </w:r>
+          </w:p>
+        </w:tc>
+        <w:tc>
+          <w:tcPr>
+            <w:tcW w:type="dxa" w:w="2835"/>
+            <w:tcMar>
+              <w:top w:w="70" w:type="dxa"/>
+              <w:start w:w="100" w:type="dxa"/>
+              <w:bottom w:w="70" w:type="dxa"/>
+              <w:end w:w="100" w:type="dxa"/>
+            </w:tcMar>
+          </w:tcPr>
+          <w:p>
+            <w:pPr>
+              <w:keepNext/>
+            </w:pPr>
+            <w:r/>
+            <w:r>
+              <w:rPr>
+                <w:rFonts w:ascii="Microsoft YaHei" w:hAnsi="Microsoft YaHei" w:eastAsia="Microsoft YaHei"/>
+                <w:sz w:val="18"/>
+              </w:rPr>
+              <w:t>删了会丢历史，但错题本仍在。</w:t>
+            </w:r>
+          </w:p>
+        </w:tc>
+      </w:tr>
+      <w:tr>
+        <w:trPr>
+          <w:cantSplit/>
+        </w:trPr>
+        <w:tc>
+          <w:tcPr>
+            <w:tcW w:type="dxa" w:w="2665"/>
+            <w:tcMar>
+              <w:top w:w="70" w:type="dxa"/>
+              <w:start w:w="100" w:type="dxa"/>
+              <w:bottom w:w="70" w:type="dxa"/>
+              <w:end w:w="100" w:type="dxa"/>
+            </w:tcMar>
+          </w:tcPr>
+          <w:p>
+            <w:pPr>
+              <w:keepNext/>
+            </w:pPr>
+            <w:r/>
+            <w:r>
+              <w:rPr>
+                <w:rFonts w:ascii="Microsoft YaHei" w:hAnsi="Microsoft YaHei" w:eastAsia="Microsoft YaHei"/>
+                <w:sz w:val="18"/>
+              </w:rPr>
               <w:t>data/cache/</w:t>
             </w:r>
           </w:p>
@@ -6005,7 +6256,57 @@
         <w:pStyle w:val="Heading2"/>
       </w:pPr>
       <w:r>
-        <w:t>11.3 备份</w:t>
+        <w:t>11.3 学习档案</w:t>
+      </w:r>
+    </w:p>
+    <w:p>
+      <w:r>
+        <w:rPr>
+          <w:rFonts w:ascii="Microsoft YaHei" w:hAnsi="Microsoft YaHei" w:eastAsia="Microsoft YaHei"/>
+          <w:b w:val="0"/>
+        </w:rPr>
+        <w:t>每轮单词/20 题完成后，data/history/ 会多一个带时间的文件，并更新 latest-quiz.json / latest-word.json。里面是完整题目、选项、你的答案、理由、对错、错误类型和讲解来源。</w:t>
+      </w:r>
+    </w:p>
+    <w:p>
+      <w:pPr>
+        <w:pStyle w:val="ListBullet"/>
+      </w:pPr>
+      <w:r>
+        <w:rPr>
+          <w:rFonts w:ascii="Microsoft YaHei" w:hAnsi="Microsoft YaHei" w:eastAsia="Microsoft YaHei"/>
+        </w:rPr>
+        <w:t>想看上次为什么错：打开 latest-quiz.json，对比 selected、correctKey、errorType、misconception。</w:t>
+      </w:r>
+    </w:p>
+    <w:p>
+      <w:pPr>
+        <w:pStyle w:val="ListBullet"/>
+      </w:pPr>
+      <w:r>
+        <w:rPr>
+          <w:rFonts w:ascii="Microsoft YaHei" w:hAnsi="Microsoft YaHei" w:eastAsia="Microsoft YaHei"/>
+        </w:rPr>
+        <w:t>想换电脑：整个 data 文件夹一起复制，history 也带走。</w:t>
+      </w:r>
+    </w:p>
+    <w:p>
+      <w:pPr>
+        <w:pStyle w:val="ListBullet"/>
+      </w:pPr>
+      <w:r>
+        <w:rPr>
+          <w:rFonts w:ascii="Microsoft YaHei" w:hAnsi="Microsoft YaHei" w:eastAsia="Microsoft YaHei"/>
+        </w:rPr>
+        <w:t>想轻量备份：至少保留 wrongbook.json、checkin.json、word_progress.json；history 是复盘资料，不是运行必需。</w:t>
+      </w:r>
+    </w:p>
+    <w:p>
+      <w:pPr>
+        <w:pStyle w:val="Heading2"/>
+      </w:pPr>
+      <w:r>
+        <w:t>11.4 备份</w:t>
       </w:r>
     </w:p>
     <w:p>
@@ -6031,7 +6332,7 @@
         <w:pStyle w:val="Heading2"/>
       </w:pPr>
       <w:r>
-        <w:t>11.4 成本控制</w:t>
+        <w:t>11.5 成本控制</w:t>
       </w:r>
     </w:p>
     <w:p>
@@ -6040,7 +6341,7 @@
           <w:rFonts w:ascii="Microsoft YaHei" w:hAnsi="Microsoft YaHei" w:eastAsia="Microsoft YaHei"/>
           <w:b w:val="0"/>
         </w:rPr>
-        <w:t>默认每天最多 60 次 DeepSeek 调用。刷题约 28 次（20 次评估 + 错题讲解缓存），单词约 10—20 次，周复盘 1 次。超过预算会自动降级本地判断，不卡住学习。</w:t>
+        <w:t>默认每天最多 60 次 DeepSeek 调用。刷题约 20 次评估 + 错题深度讲解；同一题同一选项命中缓存，第二次不再调用。单词约 10—20 次，周复盘 1 次。超过预算会自动降级本地判断，不卡住学习。</w:t>
       </w:r>
     </w:p>
     <w:p>
@@ -6049,7 +6350,7 @@
           <w:rFonts w:ascii="Microsoft YaHei" w:hAnsi="Microsoft YaHei" w:eastAsia="Microsoft YaHei"/>
           <w:b w:val="0"/>
         </w:rPr>
-        <w:t>趣味句预生成约 50 次，属于一次性设置，不在日常学习里反复调用。</w:t>
+        <w:t>一道题学满两次后，默认勾选“跳过重复讲解”，不会再次调用深度模型；想重新生成时取消勾选即可。</w:t>
       </w:r>
     </w:p>
     <w:p>
@@ -8528,7 +8829,7 @@
           <w:color w:val="5F6E67"/>
           <w:sz w:val="17"/>
         </w:rPr>
-        <w:t>CET4Coach v1.0 · 详细使用手册 · 2026-10</w:t>
+        <w:t>CET4Coach v1.1 · 详细使用手册 · 2026-10</w:t>
       </w:r>
     </w:p>
     <w:sectPr>

</xml_diff>

<commit_message>
fish version: user-provided images, cute-girl tone, portable progress, DPI/scroll fixes
</commit_message>
<xml_diff>
--- a/docs/CET4Coach-User-Manual.zh-CN.docx
+++ b/docs/CET4Coach-User-Manual.zh-CN.docx
@@ -30,7 +30,7 @@
           <w:color w:val="23352F"/>
           <w:sz w:val="56"/>
         </w:rPr>
-        <w:t>四级教练 · 详细使用手册</w:t>
+        <w:t>大肥鱼版 · 详细使用手册</w:t>
       </w:r>
     </w:p>
     <w:p>
@@ -74,7 +74,7 @@
           <w:color w:val="5F6E67"/>
           <w:sz w:val="20"/>
         </w:rPr>
-        <w:t>版本 1.1  ·  2026 年 10 月</w:t>
+        <w:t>版本 1.2-fish  ·  2026 年 10 月</w:t>
       </w:r>
     </w:p>
     <w:p/>
@@ -2586,6 +2586,41 @@
       </w:r>
     </w:p>
     <w:p>
+      <w:r>
+        <w:rPr>
+          <w:rFonts w:ascii="Microsoft YaHei" w:hAnsi="Microsoft YaHei" w:eastAsia="Microsoft YaHei"/>
+          <w:b w:val="0"/>
+        </w:rPr>
+        <w:t>本版不再强制 Per-Monitor DPI；在 150%/200% 缩放下由 Windows 整体缩放窗口，避免“字体放大了、坐标没放大”造成的文字堆叠。</w:t>
+      </w:r>
+    </w:p>
+    <w:p>
+      <w:pPr>
+        <w:pStyle w:val="Heading2"/>
+      </w:pPr>
+      <w:r>
+        <w:t>4.5 大肥鱼出现在哪里</w:t>
+      </w:r>
+    </w:p>
+    <w:p>
+      <w:r>
+        <w:rPr>
+          <w:rFonts w:ascii="Microsoft YaHei" w:hAnsi="Microsoft YaHei" w:eastAsia="Microsoft YaHei"/>
+          <w:b w:val="0"/>
+        </w:rPr>
+        <w:t>左侧栏固定显示大肥鱼的 Q 版头像和“今天也一起学吧”；下方是夜景全身立绘。答题正确/错误反馈、加载进度窗会换用不同表情。图片占用独立留白，不覆盖题干、选项和按钮。</w:t>
+      </w:r>
+    </w:p>
+    <w:p>
+      <w:r>
+        <w:rPr>
+          <w:rFonts w:ascii="Microsoft YaHei" w:hAnsi="Microsoft YaHei" w:eastAsia="Microsoft YaHei"/>
+          <w:b w:val="0"/>
+        </w:rPr>
+        <w:t>配色使用 DeepSeek 经典蓝 #4D6BFE、深蓝 #1B2A6B、浅蓝白 #F0F5FF，辅以珊瑚色和星光金。形象只用你提供的 6 张图裁切，不是项目生成，也不是抓取网络素材；详见 docs/MASCOT.md 和 MASCOT_LICENSE.md。</w:t>
+      </w:r>
+    </w:p>
+    <w:p>
       <w:pPr>
         <w:pStyle w:val="Heading1"/>
       </w:pPr>
@@ -2710,7 +2745,7 @@
         <w:rPr>
           <w:rFonts w:ascii="Microsoft YaHei" w:hAnsi="Microsoft YaHei" w:eastAsia="Microsoft YaHei"/>
         </w:rPr>
-        <w:t>反馈页显示：英文原句、中文提示/翻译、核心释义、老师反馈。</w:t>
+        <w:t>反馈页显示：英文原句、中文提示/翻译、核心释义、大肥鱼反馈。</w:t>
       </w:r>
     </w:p>
     <w:p>
@@ -3427,7 +3462,7 @@
           <w:rFonts w:ascii="Microsoft YaHei" w:hAnsi="Microsoft YaHei" w:eastAsia="Microsoft YaHei"/>
           <w:b w:val="0"/>
         </w:rPr>
-        <w:t>答对：显示正确答案、评估、老师的一句鼓励和技巧。答错：显示固定结构的讲解：</w:t>
+        <w:t>答对：显示正确答案、评估、大肥鱼的一句鼓励和技巧。答错：显示固定结构的讲解：</w:t>
       </w:r>
     </w:p>
     <w:p>
@@ -6355,6 +6390,85 @@
     </w:p>
     <w:p>
       <w:pPr>
+        <w:pStyle w:val="Heading2"/>
+      </w:pPr>
+      <w:r>
+        <w:t>11.6 跨版本学习进度包</w:t>
+      </w:r>
+    </w:p>
+    <w:p>
+      <w:r>
+        <w:rPr>
+          <w:rFonts w:ascii="Microsoft YaHei" w:hAnsi="Microsoft YaHei" w:eastAsia="Microsoft YaHei"/>
+          <w:b w:val="0"/>
+        </w:rPr>
+        <w:t>设置页最下面有“学习进度包”卡片。程序在每次答题、每轮结束、关闭时自动更新 data/progress/latest.cet4progress.json；点“导出学习进度”可另存一份带日期的 .cet4progress.json。</w:t>
+      </w:r>
+    </w:p>
+    <w:p>
+      <w:r>
+        <w:rPr>
+          <w:rFonts w:ascii="Microsoft YaHei" w:hAnsi="Microsoft YaHei" w:eastAsia="Microsoft YaHei"/>
+          <w:b w:val="0"/>
+        </w:rPr>
+        <w:t>导入时按“题干 + 选项内容”的 SHA256 指纹匹配，不依赖题库行号。因此：</w:t>
+      </w:r>
+    </w:p>
+    <w:p>
+      <w:pPr>
+        <w:pStyle w:val="ListBullet"/>
+      </w:pPr>
+      <w:r>
+        <w:rPr>
+          <w:rFonts w:ascii="Microsoft YaHei" w:hAnsi="Microsoft YaHei" w:eastAsia="Microsoft YaHei"/>
+        </w:rPr>
+        <w:t>新题库换了 id、只调了选项顺序：按内容指纹仍能找到，进度继续。</w:t>
+      </w:r>
+    </w:p>
+    <w:p>
+      <w:pPr>
+        <w:pStyle w:val="ListBullet"/>
+      </w:pPr>
+      <w:r>
+        <w:rPr>
+          <w:rFonts w:ascii="Microsoft YaHei" w:hAnsi="Microsoft YaHei" w:eastAsia="Microsoft YaHei"/>
+        </w:rPr>
+        <w:t>新版本有、老版本没有的题：导入后保留为进度包题目，并进入老版本题库；对应讲解/原文快照一起带入。</w:t>
+      </w:r>
+    </w:p>
+    <w:p>
+      <w:pPr>
+        <w:pStyle w:val="ListBullet"/>
+      </w:pPr>
+      <w:r>
+        <w:rPr>
+          <w:rFonts w:ascii="Microsoft YaHei" w:hAnsi="Microsoft YaHei" w:eastAsia="Microsoft YaHei"/>
+        </w:rPr>
+        <w:t>单词按 word 合并，打卡按日期取并集；不会因为换题库把已学词、连续天数清零。</w:t>
+      </w:r>
+    </w:p>
+    <w:p>
+      <w:pPr>
+        <w:pStyle w:val="ListBullet"/>
+      </w:pPr>
+      <w:r>
+        <w:rPr>
+          <w:rFonts w:ascii="Microsoft YaHei" w:hAnsi="Microsoft YaHei" w:eastAsia="Microsoft YaHei"/>
+        </w:rPr>
+        <w:t>每次更新都只增加 schemaVersion，不删除旧字段；未来版本继续按字段存在性读取。</w:t>
+      </w:r>
+    </w:p>
+    <w:p>
+      <w:r>
+        <w:rPr>
+          <w:rFonts w:ascii="Microsoft YaHei" w:hAnsi="Microsoft YaHei" w:eastAsia="Microsoft YaHei"/>
+          <w:b w:val="0"/>
+        </w:rPr>
+        <w:t>换电脑：原电脑导出 .cet4progress.json，新电脑在设置页导入即可。原电脑的 data 文件夹仍建议整体备份。</w:t>
+      </w:r>
+    </w:p>
+    <w:p>
+      <w:pPr>
         <w:pStyle w:val="Heading1"/>
       </w:pPr>
       <w:r>
@@ -8829,7 +8943,7 @@
           <w:color w:val="5F6E67"/>
           <w:sz w:val="17"/>
         </w:rPr>
-        <w:t>CET4Coach v1.1 · 详细使用手册 · 2026-10</w:t>
+        <w:t>CET4Coach 大肥鱼版 v1.2-fish · 详细使用手册 · 2026-10</w:t>
       </w:r>
     </w:p>
     <w:sectPr>

</xml_diff>

<commit_message>
v1.3.0: listening practice, word-by-word study, fullscreen reading, daily save reminder
</commit_message>
<xml_diff>
--- a/docs/CET4Coach-User-Manual.zh-CN.docx
+++ b/docs/CET4Coach-User-Manual.zh-CN.docx
@@ -44,7 +44,7 @@
           <w:color w:val="5F6E67"/>
           <w:sz w:val="22"/>
         </w:rPr>
-        <w:t>1500 高频词 · 20 题限时 · 错题画像 · 听力整理 · 可选 DeepSeek 讲解</w:t>
+        <w:t>1500 高频词 · 20 题限时 · 听力练习 · 错题画像 · 可选 DeepSeek 讲解</w:t>
       </w:r>
     </w:p>
     <w:p/>
@@ -3339,7 +3339,7 @@
         <w:rPr>
           <w:rFonts w:ascii="Microsoft YaHei" w:hAnsi="Microsoft YaHei" w:eastAsia="Microsoft YaHei"/>
         </w:rPr>
-        <w:t>如果听力音频缺失，按规则跳过听力，改以仔细阅读为重点，并在计划中提示。</w:t>
+        <w:t>听力题使用原音频；没有原音频时用浏览器英语语音朗读（电脑合成音），不再因为音频库为空就整段跳过听力。</w:t>
       </w:r>
     </w:p>
     <w:p>
@@ -3397,7 +3397,7 @@
         <w:rPr>
           <w:rFonts w:ascii="Microsoft YaHei" w:hAnsi="Microsoft YaHei" w:eastAsia="Microsoft YaHei"/>
         </w:rPr>
-        <w:t>2. 听力题：先点“播放听力”，PotPlayer 打开；听完点“我已听完，显示选项”。播放次数会被记录。</w:t>
+        <w:t>2. 听力题：先点“播放听力”。有原音频时 PotPlayer 打开；没有原音频时打开一个小浏览器窗口，用英语语音朗读。听完点“我已听完，显示选项”，播放次数会被记录。</w:t>
       </w:r>
     </w:p>
     <w:p>
@@ -3445,7 +3445,9 @@
         <w:rPr>
           <w:rFonts w:ascii="Microsoft YaHei" w:hAnsi="Microsoft YaHei" w:eastAsia="Microsoft YaHei"/>
         </w:rPr>
-        <w:t>6. 看完反馈点“下一题”。不点不会自动跳。</w:t>
+        <w:t>6. 卡住时，点“我不会，逐词讲解”（听力题显示“听不懂？逐词讲解”），会打开全文翻译和逐词讲解，不直接公布答案。原文太长时，点“全屏阅读”或双击原文，打开独立阅读窗，可用 A-/A+ 放大、全屏查看。</w:t>
+        <w:br/>
+        <w:t>看完反馈点“下一题”。不点不会自动跳。</w:t>
       </w:r>
     </w:p>
     <w:p>
@@ -3595,7 +3597,7 @@
           <w:rFonts w:ascii="Microsoft YaHei" w:hAnsi="Microsoft YaHei" w:eastAsia="Microsoft YaHei"/>
           <w:b w:val="0"/>
         </w:rPr>
-        <w:t>程序只从当天临时工作区播放；没有临时音频就按“缺音频”提示，不会偷偷拿源库文件。只关闭本系统启动的 PotPlayer 进程，不会强制关闭你自己的播放器。</w:t>
+        <w:t>有原音频时只从当天临时工作区播放；没有原音频时用浏览器 speechSynthesis 朗读。浏览器语音打不开时，可以点“逐词讲解”看听力原文和翻译。只关闭本系统启动的 PotPlayer 进程，不会强制关闭你自己的播放器。</w:t>
       </w:r>
     </w:p>
     <w:p>
@@ -3648,6 +3650,8 @@
           <w:b w:val="0"/>
         </w:rPr>
         <w:t>每轮单词/刷题完成后，完整记录写入 data/history/；文件名带日期和时间，另有 latest-quiz.json / latest-word.json。内容包括题目、选项、你的答案、理由、对错、错误类型、讲解来源。中途退出仍保存在 data/sessions/，下次继续。</w:t>
+        <w:br/>
+        <w:t>当天完成单词或 20 题后，程序还会自动保存 data/progress/latest.cet4progress.json，并弹一次“今日进度已保存”的提醒；同日备份为 data/progress/backup-YYYYMMDD.cet4progress.json。建议每周把整个 data 文件夹复制到 U 盘或网盘。</w:t>
       </w:r>
     </w:p>
     <w:p>

</xml_diff>

<commit_message>
v1.3.1: fix reader layout occlusion and browser speech cutoff
</commit_message>
<xml_diff>
--- a/docs/CET4Coach-User-Manual.zh-CN.docx
+++ b/docs/CET4Coach-User-Manual.zh-CN.docx
@@ -2592,6 +2592,8 @@
           <w:b w:val="0"/>
         </w:rPr>
         <w:t>本版不再强制 Per-Monitor DPI；在 150%/200% 缩放下由 Windows 整体缩放窗口，避免“字体放大了、坐标没放大”造成的文字堆叠。</w:t>
+        <w:br/>
+        <w:t>阅读窗、逐词讲解窗按屏幕工作区自动收缩，顶部按钮和正文分成独立行，正文有边距、自动换行和垂直滚动条，不会压到标题栏。</w:t>
       </w:r>
     </w:p>
     <w:p>
@@ -3597,7 +3599,7 @@
           <w:rFonts w:ascii="Microsoft YaHei" w:hAnsi="Microsoft YaHei" w:eastAsia="Microsoft YaHei"/>
           <w:b w:val="0"/>
         </w:rPr>
-        <w:t>有原音频时只从当天临时工作区播放；没有原音频时用浏览器 speechSynthesis 朗读。浏览器语音打不开时，可以点“逐词讲解”看听力原文和翻译。只关闭本系统启动的 PotPlayer 进程，不会强制关闭你自己的播放器。</w:t>
+        <w:t>有原音频时只从当天临时工作区播放；没有原音频时用浏览器 speechSynthesis 朗读。浏览器语音页有“开始播放”按钮；长听力按句分段排队，不会说两句就停。若自动播放被拦截，点一下“开始播放”。浏览器语音打不开时，可以点“逐词讲解”看听力原文和翻译。只关闭本系统启动的 PotPlayer 进程，不会强制关闭你自己的播放器。</w:t>
       </w:r>
     </w:p>
     <w:p>

</xml_diff>

<commit_message>
v1.3.2: local downloaded listening audio and bilingual deep feedback
</commit_message>
<xml_diff>
--- a/docs/CET4Coach-User-Manual.zh-CN.docx
+++ b/docs/CET4Coach-User-Manual.zh-CN.docx
@@ -3466,7 +3466,7 @@
           <w:rFonts w:ascii="Microsoft YaHei" w:hAnsi="Microsoft YaHei" w:eastAsia="Microsoft YaHei"/>
           <w:b w:val="0"/>
         </w:rPr>
-        <w:t>答对：显示正确答案、评估、大肥鱼的一句鼓励和技巧。答错：显示固定结构的讲解：</w:t>
+        <w:t>答对：显示正确答案、评估、大肥鱼的一句鼓励和技巧。答错：显示固定结构的讲解（先告诉选什么，再讲为什么；选项中英对译）：</w:t>
       </w:r>
     </w:p>
     <w:p>
@@ -3477,7 +3477,7 @@
         <w:rPr>
           <w:rFonts w:ascii="Microsoft YaHei" w:hAnsi="Microsoft YaHei" w:eastAsia="Microsoft YaHei"/>
         </w:rPr>
-        <w:t>这道题考什么（一句话）。</w:t>
+        <w:t>这道题选什么：正确选项字母 + 完整英文 + 准确中文翻译。</w:t>
       </w:r>
     </w:p>
     <w:p>
@@ -3488,7 +3488,7 @@
         <w:rPr>
           <w:rFonts w:ascii="Microsoft YaHei" w:hAnsi="Microsoft YaHei" w:eastAsia="Microsoft YaHei"/>
         </w:rPr>
-        <w:t>正确答案为什么对（回原文/听力信号词）。</w:t>
+        <w:t>为什么选它：先给结论，再回原文/听力信号词，讲清同义替换和为什么不是别的。</w:t>
       </w:r>
     </w:p>
     <w:p>
@@ -3499,7 +3499,7 @@
         <w:rPr>
           <w:rFonts w:ascii="Microsoft YaHei" w:hAnsi="Microsoft YaHei" w:eastAsia="Microsoft YaHei"/>
         </w:rPr>
-        <w:t>你选的选项为什么是陷阱。</w:t>
+        <w:t>每个选项：完整英文 + 中文翻译 + 为什么选/不选；不是只给中文。</w:t>
       </w:r>
     </w:p>
     <w:p>
@@ -3599,7 +3599,7 @@
           <w:rFonts w:ascii="Microsoft YaHei" w:hAnsi="Microsoft YaHei" w:eastAsia="Microsoft YaHei"/>
           <w:b w:val="0"/>
         </w:rPr>
-        <w:t>有原音频时只从当天临时工作区播放；没有原音频时用浏览器 speechSynthesis 朗读。浏览器语音页有“开始播放”按钮；长听力按句分段排队，不会说两句就停。若自动播放被拦截，点一下“开始播放”。浏览器语音打不开时，可以点“逐词讲解”看听力原文和翻译。只关闭本系统启动的 PotPlayer 进程，不会强制关闭你自己的播放器。</w:t>
+        <w:t>有原音频时只从当天临时工作区播放。没有原音频时，程序先从在线语音服务把 MP3 下载到临时目录，再用 PotPlayer 本地播放；播放结束/停止后删除临时 MP3。下载失败会提示网络或音频库问题，不会假装播放。只关闭本系统启动的 PotPlayer 进程，不会强制关闭你自己的播放器。</w:t>
       </w:r>
     </w:p>
     <w:p>

</xml_diff>

<commit_message>
v1.3.5: player selection, startup progress reminder, builtin playback
</commit_message>
<xml_diff>
--- a/docs/CET4Coach-User-Manual.zh-CN.docx
+++ b/docs/CET4Coach-User-Manual.zh-CN.docx
@@ -2594,6 +2594,8 @@
         <w:t>本版不再强制 Per-Monitor DPI；在 150%/200% 缩放下由 Windows 整体缩放窗口，避免“字体放大了、坐标没放大”造成的文字堆叠。</w:t>
         <w:br/>
         <w:t>阅读窗、逐词讲解窗按屏幕工作区自动收缩，顶部按钮和正文分成独立行，正文有边距、自动换行和垂直滚动条，不会压到标题栏。</w:t>
+        <w:br/>
+        <w:t>每次打开程序会显示可关闭的“学习进度提醒”弹窗，带大肥鱼图片，可直接保存进度或打开 data 文件夹。</w:t>
       </w:r>
     </w:p>
     <w:p>
@@ -3599,7 +3601,9 @@
           <w:rFonts w:ascii="Microsoft YaHei" w:hAnsi="Microsoft YaHei" w:eastAsia="Microsoft YaHei"/>
           <w:b w:val="0"/>
         </w:rPr>
-        <w:t>有原音频时只从当天临时工作区播放。没有原音频时，程序优先用内置 eSpeak 在本地生成 WAV；本地生成失败才尝试在线下载 MP3。两种方式都先落到临时目录，再用 PotPlayer 本地播放，播放结束/停止后删除。只关闭本系统启动的 PotPlayer 进程，不会强制关闭你自己的播放器。</w:t>
+        <w:t>有原音频时只从当天临时工作区播放。没有原音频时，程序优先用内置 eSpeak 在本地生成 WAV；本地生成失败才尝试在线下载 MP3。两种方式都先落到临时目录再播放，播放结束/停止后删除。</w:t>
+        <w:br/>
+        <w:t>设置与诊断 → 听力播放器 可选择：内置播放器（推荐，WAV/MP3，不依赖外部程序）、PotPlayer、Windows Media Player、系统默认程序、自定义程序。选择 PotPlayer 但未安装时，播放前会询问是否打开官方下载页；选“否”自动改用内置播放器。</w:t>
       </w:r>
     </w:p>
     <w:p>

</xml_diff>

<commit_message>
v1.3.7: original CET4 audio pack, no synthetic audio
</commit_message>
<xml_diff>
--- a/docs/CET4Coach-User-Manual.zh-CN.docx
+++ b/docs/CET4Coach-User-Manual.zh-CN.docx
@@ -3343,7 +3343,7 @@
         <w:rPr>
           <w:rFonts w:ascii="Microsoft YaHei" w:hAnsi="Microsoft YaHei" w:eastAsia="Microsoft YaHei"/>
         </w:rPr>
-        <w:t>听力题使用原音频；没有原音频时用浏览器英语语音朗读（电脑合成音），不再因为音频库为空就整段跳过听力。</w:t>
+        <w:t>听力题使用原音频；音频随发布包放在 library/audio（2020—2025，按套卷拆 Section A/B/C），不下载、不合成；缺音频时会提示放回音频包。</w:t>
       </w:r>
     </w:p>
     <w:p>
@@ -3601,7 +3601,7 @@
           <w:rFonts w:ascii="Microsoft YaHei" w:hAnsi="Microsoft YaHei" w:eastAsia="Microsoft YaHei"/>
           <w:b w:val="0"/>
         </w:rPr>
-        <w:t>有原音频时只从当天临时工作区播放。没有原音频时，程序优先用内置 eSpeak 在本地生成 WAV；本地生成失败才尝试在线下载 MP3。两种方式都先落到临时目录再播放，播放结束/停止后删除。</w:t>
+        <w:t>听力音频随发布包放在 `library/audio`（2020—2025 原音频，按套卷拆为 Section A/B/C）。播放时只读取本地原音频，不下载、不合成；没有音频会提示把音频包放回程序目录。</w:t>
         <w:br/>
         <w:t>设置与诊断 → 听力播放器 可选择：内置播放器（推荐，WAV/MP3，不依赖外部程序）、PotPlayer、Windows Media Player、系统默认程序、自定义程序。选择 PotPlayer 但未安装时，播放前会询问是否打开官方下载页；选“否”自动改用内置播放器。</w:t>
       </w:r>

</xml_diff>

<commit_message>
v1.3.9: clear today progress button
</commit_message>
<xml_diff>
--- a/docs/CET4Coach-User-Manual.zh-CN.docx
+++ b/docs/CET4Coach-User-Manual.zh-CN.docx
@@ -6475,6 +6475,15 @@
           <w:b w:val="0"/>
         </w:rPr>
         <w:t>换电脑：原电脑导出 .cet4progress.json，新电脑在设置页导入即可。原电脑的 data 文件夹仍建议整体备份。</w:t>
+      </w:r>
+    </w:p>
+    <w:p>
+      <w:r>
+        <w:rPr>
+          <w:rFonts w:ascii="Microsoft YaHei" w:hAnsi="Microsoft YaHei" w:eastAsia="Microsoft YaHei"/>
+          <w:b w:val="0"/>
+        </w:rPr>
+        <w:t>清空今日学习进度：同一张“学习进度包”卡片右侧有红色“清空今日学习进度”按钮。它只清空当天会话、计划、历史、打卡、当天新建错题和当天已做记录；单词累计掌握状态与更早历史保留。清空前会自动备份到 backup/clear-today-时间戳，误点后仍可从备份恢复。</w:t>
       </w:r>
     </w:p>
     <w:p>

</xml_diff>

<commit_message>
v1.4.0: home and question chat with DeepSeek
</commit_message>
<xml_diff>
--- a/docs/CET4Coach-User-Manual.zh-CN.docx
+++ b/docs/CET4Coach-User-Manual.zh-CN.docx
@@ -6484,6 +6484,15 @@
           <w:b w:val="0"/>
         </w:rPr>
         <w:t>清空今日学习进度：同一张“学习进度包”卡片右侧有红色“清空今日学习进度”按钮。它只清空当天会话、计划、历史、打卡、当天新建错题和当天已做记录；单词累计掌握状态与更早历史保留。清空前会自动备份到 backup/clear-today-时间戳，误点后仍可从备份恢复。</w:t>
+      </w:r>
+    </w:p>
+    <w:p>
+      <w:r>
+        <w:rPr>
+          <w:rFonts w:ascii="Microsoft YaHei" w:hAnsi="Microsoft YaHei" w:eastAsia="Microsoft YaHei"/>
+          <w:b w:val="0"/>
+        </w:rPr>
+        <w:t>对话讲解：首页底部、题目页底部和反馈页底部各有一个聊天框，接入同一个 DeepSeek API Key。首页聊天回答听力技巧、阅读方法、时间安排等通用问题；题目/反馈聊天会自动带上题干、选项、原文或材料、已提交的答案与解析，提交前只给提示、不直接报答案。聊天不编造原文；没有 Key 时会提示先到“设置与诊断”绑定，与深度讲解共用同一个 Key。</w:t>
       </w:r>
     </w:p>
     <w:p>

</xml_diff>

<commit_message>
v1.4.1: blue and warm white UI palette
</commit_message>
<xml_diff>
--- a/docs/CET4Coach-User-Manual.zh-CN.docx
+++ b/docs/CET4Coach-User-Manual.zh-CN.docx
@@ -12,7 +12,7 @@
         <w:rPr>
           <w:rFonts w:ascii="Microsoft YaHei" w:hAnsi="Microsoft YaHei" w:eastAsia="Microsoft YaHei"/>
           <w:b/>
-          <w:color w:val="1F6F5C"/>
+          <w:color w:val="276FBF"/>
           <w:sz w:val="44"/>
         </w:rPr>
         <w:t>CET4Coach</w:t>
@@ -27,7 +27,7 @@
         <w:rPr>
           <w:rFonts w:ascii="Microsoft YaHei" w:hAnsi="Microsoft YaHei" w:eastAsia="Microsoft YaHei"/>
           <w:b/>
-          <w:color w:val="23352F"/>
+          <w:color w:val="1F2937"/>
           <w:sz w:val="56"/>
         </w:rPr>
         <w:t>大肥鱼版 · 详细使用手册</w:t>
@@ -41,7 +41,7 @@
         <w:rPr>
           <w:rFonts w:ascii="Microsoft YaHei" w:hAnsi="Microsoft YaHei" w:eastAsia="Microsoft YaHei"/>
           <w:b w:val="0"/>
-          <w:color w:val="5F6E67"/>
+          <w:color w:val="64748B"/>
           <w:sz w:val="22"/>
         </w:rPr>
         <w:t>1500 高频词 · 20 题限时 · 听力练习 · 错题画像 · 可选 DeepSeek 讲解</w:t>
@@ -56,7 +56,7 @@
         <w:rPr>
           <w:rFonts w:ascii="Microsoft YaHei" w:hAnsi="Microsoft YaHei" w:eastAsia="Microsoft YaHei"/>
           <w:b w:val="0"/>
-          <w:color w:val="5F6E67"/>
+          <w:color w:val="64748B"/>
           <w:sz w:val="20"/>
         </w:rPr>
         <w:t>Windows 10 / 11  ·  本地运行  ·  PowerShell 5.1 / 7</w:t>
@@ -71,7 +71,7 @@
         <w:rPr>
           <w:rFonts w:ascii="Microsoft YaHei" w:hAnsi="Microsoft YaHei" w:eastAsia="Microsoft YaHei"/>
           <w:b w:val="0"/>
-          <w:color w:val="5F6E67"/>
+          <w:color w:val="64748B"/>
           <w:sz w:val="20"/>
         </w:rPr>
         <w:t>版本 1.2-fish  ·  2026 年 10 月</w:t>
@@ -86,7 +86,7 @@
         <w:rPr>
           <w:rFonts w:ascii="Microsoft YaHei" w:hAnsi="Microsoft YaHei" w:eastAsia="Microsoft YaHei"/>
           <w:b w:val="0"/>
-          <w:color w:val="B45F1E"/>
+          <w:color w:val="5B95D6"/>
           <w:sz w:val="18"/>
         </w:rPr>
         <w:t>项目地址：https://github.com/KuzuryuYaichi-0721/cet4-coach</w:t>
@@ -100,7 +100,7 @@
         <w:rPr>
           <w:rFonts w:ascii="Microsoft YaHei" w:hAnsi="Microsoft YaHei" w:eastAsia="Microsoft YaHei"/>
           <w:b w:val="0"/>
-          <w:color w:val="B45F1E"/>
+          <w:color w:val="5B95D6"/>
           <w:sz w:val="18"/>
         </w:rPr>
         <w:t>下载地址：https://github.com/KuzuryuYaichi-0721/cet4-coach/releases/latest</w:t>
@@ -121,7 +121,7 @@
         <w:tc>
           <w:tcPr>
             <w:tcW w:type="dxa" w:w="9412"/>
-            <w:shd w:fill="FFF2CC"/>
+            <w:shd w:fill="F1F6FC"/>
             <w:tcMar>
               <w:top w:w="100" w:type="dxa"/>
               <w:start w:w="140" w:type="dxa"/>
@@ -134,7 +134,7 @@
               <w:rPr>
                 <w:rFonts w:ascii="Microsoft YaHei" w:hAnsi="Microsoft YaHei" w:eastAsia="Microsoft YaHei"/>
                 <w:b/>
-                <w:color w:val="1F6F5C"/>
+                <w:color w:val="276FBF"/>
               </w:rPr>
               <w:t>先读这一句</w:t>
             </w:r>
@@ -156,7 +156,7 @@
         <w:rPr>
           <w:rFonts w:ascii="Microsoft YaHei" w:hAnsi="Microsoft YaHei" w:eastAsia="Microsoft YaHei"/>
           <w:b w:val="0"/>
-          <w:color w:val="5F6E67"/>
+          <w:color w:val="64748B"/>
           <w:sz w:val="17"/>
         </w:rPr>
         <w:t>重要：代码是 MIT 开源；题库、词典、翻译和真题句等数据不是 MIT 授权，仅供个人学习。详见仓库 DATA_LICENSE.md 与 THIRD_PARTY_NOTICES.md。</w:t>
@@ -385,7 +385,7 @@
         <w:tc>
           <w:tcPr>
             <w:tcW w:type="dxa" w:w="9412"/>
-            <w:shd w:fill="E7F3EC"/>
+            <w:shd w:fill="EAF2FB"/>
             <w:tcMar>
               <w:top w:w="100" w:type="dxa"/>
               <w:start w:w="140" w:type="dxa"/>
@@ -398,7 +398,7 @@
               <w:rPr>
                 <w:rFonts w:ascii="Microsoft YaHei" w:hAnsi="Microsoft YaHei" w:eastAsia="Microsoft YaHei"/>
                 <w:b/>
-                <w:color w:val="1F6F5C"/>
+                <w:color w:val="276FBF"/>
               </w:rPr>
               <w:t>建议阅读顺序</w:t>
             </w:r>
@@ -564,7 +564,7 @@
         <w:tc>
           <w:tcPr>
             <w:tcW w:type="dxa" w:w="9412"/>
-            <w:shd w:fill="E7F3EC"/>
+            <w:shd w:fill="EAF2FB"/>
             <w:tcMar>
               <w:top w:w="100" w:type="dxa"/>
               <w:start w:w="140" w:type="dxa"/>
@@ -577,7 +577,7 @@
               <w:rPr>
                 <w:rFonts w:ascii="Microsoft YaHei" w:hAnsi="Microsoft YaHei" w:eastAsia="Microsoft YaHei"/>
                 <w:b/>
-                <w:color w:val="1F6F5C"/>
+                <w:color w:val="276FBF"/>
               </w:rPr>
               <w:t>一句话理解</w:t>
             </w:r>
@@ -670,7 +670,7 @@
         <w:tc>
           <w:tcPr>
             <w:tcW w:type="dxa" w:w="2721"/>
-            <w:shd w:fill="1F6F5C"/>
+            <w:shd w:fill="276FBF"/>
             <w:tcMar>
               <w:top w:w="70" w:type="dxa"/>
               <w:start w:w="100" w:type="dxa"/>
@@ -697,7 +697,7 @@
         <w:tc>
           <w:tcPr>
             <w:tcW w:type="dxa" w:w="6520"/>
-            <w:shd w:fill="1F6F5C"/>
+            <w:shd w:fill="276FBF"/>
             <w:tcMar>
               <w:top w:w="70" w:type="dxa"/>
               <w:start w:w="100" w:type="dxa"/>
@@ -1357,7 +1357,7 @@
         <w:tc>
           <w:tcPr>
             <w:tcW w:type="dxa" w:w="2041"/>
-            <w:shd w:fill="1F6F5C"/>
+            <w:shd w:fill="276FBF"/>
             <w:tcMar>
               <w:top w:w="70" w:type="dxa"/>
               <w:start w:w="100" w:type="dxa"/>
@@ -1384,7 +1384,7 @@
         <w:tc>
           <w:tcPr>
             <w:tcW w:type="dxa" w:w="3515"/>
-            <w:shd w:fill="1F6F5C"/>
+            <w:shd w:fill="276FBF"/>
             <w:tcMar>
               <w:top w:w="70" w:type="dxa"/>
               <w:start w:w="100" w:type="dxa"/>
@@ -1411,7 +1411,7 @@
         <w:tc>
           <w:tcPr>
             <w:tcW w:type="dxa" w:w="3685"/>
-            <w:shd w:fill="1F6F5C"/>
+            <w:shd w:fill="276FBF"/>
             <w:tcMar>
               <w:top w:w="70" w:type="dxa"/>
               <w:start w:w="100" w:type="dxa"/>
@@ -1989,7 +1989,7 @@
         <w:tc>
           <w:tcPr>
             <w:tcW w:type="dxa" w:w="9412"/>
-            <w:shd w:fill="FFF2CC"/>
+            <w:shd w:fill="F1F6FC"/>
             <w:tcMar>
               <w:top w:w="100" w:type="dxa"/>
               <w:start w:w="140" w:type="dxa"/>
@@ -2002,7 +2002,7 @@
               <w:rPr>
                 <w:rFonts w:ascii="Microsoft YaHei" w:hAnsi="Microsoft YaHei" w:eastAsia="Microsoft YaHei"/>
                 <w:b/>
-                <w:color w:val="1F6F5C"/>
+                <w:color w:val="276FBF"/>
               </w:rPr>
               <w:t>第一次不要做太多</w:t>
             </w:r>
@@ -2115,7 +2115,7 @@
         <w:tc>
           <w:tcPr>
             <w:tcW w:type="dxa" w:w="2551"/>
-            <w:shd w:fill="1F6F5C"/>
+            <w:shd w:fill="276FBF"/>
             <w:tcMar>
               <w:top w:w="70" w:type="dxa"/>
               <w:start w:w="100" w:type="dxa"/>
@@ -2142,7 +2142,7 @@
         <w:tc>
           <w:tcPr>
             <w:tcW w:type="dxa" w:w="6690"/>
-            <w:shd w:fill="1F6F5C"/>
+            <w:shd w:fill="276FBF"/>
             <w:tcMar>
               <w:top w:w="70" w:type="dxa"/>
               <w:start w:w="100" w:type="dxa"/>
@@ -2880,7 +2880,7 @@
         <w:tc>
           <w:tcPr>
             <w:tcW w:type="dxa" w:w="1814"/>
-            <w:shd w:fill="1F6F5C"/>
+            <w:shd w:fill="276FBF"/>
             <w:tcMar>
               <w:top w:w="70" w:type="dxa"/>
               <w:start w:w="100" w:type="dxa"/>
@@ -2907,7 +2907,7 @@
         <w:tc>
           <w:tcPr>
             <w:tcW w:type="dxa" w:w="4252"/>
-            <w:shd w:fill="1F6F5C"/>
+            <w:shd w:fill="276FBF"/>
             <w:tcMar>
               <w:top w:w="70" w:type="dxa"/>
               <w:start w:w="100" w:type="dxa"/>
@@ -2934,7 +2934,7 @@
         <w:tc>
           <w:tcPr>
             <w:tcW w:type="dxa" w:w="2721"/>
-            <w:shd w:fill="1F6F5C"/>
+            <w:shd w:fill="276FBF"/>
             <w:tcMar>
               <w:top w:w="70" w:type="dxa"/>
               <w:start w:w="100" w:type="dxa"/>
@@ -3704,7 +3704,7 @@
         <w:tc>
           <w:tcPr>
             <w:tcW w:type="dxa" w:w="2381"/>
-            <w:shd w:fill="1F6F5C"/>
+            <w:shd w:fill="276FBF"/>
             <w:tcMar>
               <w:top w:w="70" w:type="dxa"/>
               <w:start w:w="100" w:type="dxa"/>
@@ -3731,7 +3731,7 @@
         <w:tc>
           <w:tcPr>
             <w:tcW w:type="dxa" w:w="6860"/>
-            <w:shd w:fill="1F6F5C"/>
+            <w:shd w:fill="276FBF"/>
             <w:tcMar>
               <w:top w:w="70" w:type="dxa"/>
               <w:start w:w="100" w:type="dxa"/>
@@ -4264,7 +4264,7 @@
         <w:tc>
           <w:tcPr>
             <w:tcW w:type="dxa" w:w="9412"/>
-            <w:shd w:fill="FFF2CC"/>
+            <w:shd w:fill="F1F6FC"/>
             <w:tcMar>
               <w:top w:w="100" w:type="dxa"/>
               <w:start w:w="140" w:type="dxa"/>
@@ -4277,7 +4277,7 @@
               <w:rPr>
                 <w:rFonts w:ascii="Microsoft YaHei" w:hAnsi="Microsoft YaHei" w:eastAsia="Microsoft YaHei"/>
                 <w:b/>
-                <w:color w:val="1F6F5C"/>
+                <w:color w:val="276FBF"/>
               </w:rPr>
               <w:t>不要抄答案</w:t>
             </w:r>
@@ -4466,7 +4466,7 @@
         <w:tc>
           <w:tcPr>
             <w:tcW w:type="dxa" w:w="1984"/>
-            <w:shd w:fill="1F6F5C"/>
+            <w:shd w:fill="276FBF"/>
             <w:tcMar>
               <w:top w:w="70" w:type="dxa"/>
               <w:start w:w="100" w:type="dxa"/>
@@ -4493,7 +4493,7 @@
         <w:tc>
           <w:tcPr>
             <w:tcW w:type="dxa" w:w="3969"/>
-            <w:shd w:fill="1F6F5C"/>
+            <w:shd w:fill="276FBF"/>
             <w:tcMar>
               <w:top w:w="70" w:type="dxa"/>
               <w:start w:w="100" w:type="dxa"/>
@@ -4520,7 +4520,7 @@
         <w:tc>
           <w:tcPr>
             <w:tcW w:type="dxa" w:w="3288"/>
-            <w:shd w:fill="1F6F5C"/>
+            <w:shd w:fill="276FBF"/>
             <w:tcMar>
               <w:top w:w="70" w:type="dxa"/>
               <w:start w:w="100" w:type="dxa"/>
@@ -5001,7 +5001,7 @@
         <w:tc>
           <w:tcPr>
             <w:tcW w:type="dxa" w:w="1984"/>
-            <w:shd w:fill="1F6F5C"/>
+            <w:shd w:fill="276FBF"/>
             <w:tcMar>
               <w:top w:w="70" w:type="dxa"/>
               <w:start w:w="100" w:type="dxa"/>
@@ -5028,7 +5028,7 @@
         <w:tc>
           <w:tcPr>
             <w:tcW w:type="dxa" w:w="3402"/>
-            <w:shd w:fill="1F6F5C"/>
+            <w:shd w:fill="276FBF"/>
             <w:tcMar>
               <w:top w:w="70" w:type="dxa"/>
               <w:start w:w="100" w:type="dxa"/>
@@ -5055,7 +5055,7 @@
         <w:tc>
           <w:tcPr>
             <w:tcW w:type="dxa" w:w="3855"/>
-            <w:shd w:fill="1F6F5C"/>
+            <w:shd w:fill="276FBF"/>
             <w:tcMar>
               <w:top w:w="70" w:type="dxa"/>
               <w:start w:w="100" w:type="dxa"/>
@@ -5317,7 +5317,7 @@
         <w:tc>
           <w:tcPr>
             <w:tcW w:type="dxa" w:w="9412"/>
-            <w:shd w:fill="FFF2CC"/>
+            <w:shd w:fill="F1F6FC"/>
             <w:tcMar>
               <w:top w:w="100" w:type="dxa"/>
               <w:start w:w="140" w:type="dxa"/>
@@ -5330,7 +5330,7 @@
               <w:rPr>
                 <w:rFonts w:ascii="Microsoft YaHei" w:hAnsi="Microsoft YaHei" w:eastAsia="Microsoft YaHei"/>
                 <w:b/>
-                <w:color w:val="1F6F5C"/>
+                <w:color w:val="276FBF"/>
               </w:rPr>
               <w:t>关于“刷完题库”</w:t>
             </w:r>
@@ -5455,7 +5455,7 @@
         <w:tc>
           <w:tcPr>
             <w:tcW w:type="dxa" w:w="2665"/>
-            <w:shd w:fill="1F6F5C"/>
+            <w:shd w:fill="276FBF"/>
             <w:tcMar>
               <w:top w:w="70" w:type="dxa"/>
               <w:start w:w="100" w:type="dxa"/>
@@ -5482,7 +5482,7 @@
         <w:tc>
           <w:tcPr>
             <w:tcW w:type="dxa" w:w="4309"/>
-            <w:shd w:fill="1F6F5C"/>
+            <w:shd w:fill="276FBF"/>
             <w:tcMar>
               <w:top w:w="70" w:type="dxa"/>
               <w:start w:w="100" w:type="dxa"/>
@@ -5509,7 +5509,7 @@
         <w:tc>
           <w:tcPr>
             <w:tcW w:type="dxa" w:w="2835"/>
-            <w:shd w:fill="1F6F5C"/>
+            <w:shd w:fill="276FBF"/>
             <w:tcMar>
               <w:top w:w="70" w:type="dxa"/>
               <w:start w:w="100" w:type="dxa"/>
@@ -6548,7 +6548,7 @@
         <w:tc>
           <w:tcPr>
             <w:tcW w:type="dxa" w:w="907"/>
-            <w:shd w:fill="1F6F5C"/>
+            <w:shd w:fill="276FBF"/>
             <w:tcMar>
               <w:top w:w="70" w:type="dxa"/>
               <w:start w:w="100" w:type="dxa"/>
@@ -6575,7 +6575,7 @@
         <w:tc>
           <w:tcPr>
             <w:tcW w:type="dxa" w:w="3969"/>
-            <w:shd w:fill="1F6F5C"/>
+            <w:shd w:fill="276FBF"/>
             <w:tcMar>
               <w:top w:w="70" w:type="dxa"/>
               <w:start w:w="100" w:type="dxa"/>
@@ -6602,7 +6602,7 @@
         <w:tc>
           <w:tcPr>
             <w:tcW w:type="dxa" w:w="4535"/>
-            <w:shd w:fill="1F6F5C"/>
+            <w:shd w:fill="276FBF"/>
             <w:tcMar>
               <w:top w:w="70" w:type="dxa"/>
               <w:start w:w="100" w:type="dxa"/>
@@ -7195,7 +7195,7 @@
         <w:tc>
           <w:tcPr>
             <w:tcW w:type="dxa" w:w="1928"/>
-            <w:shd w:fill="1F6F5C"/>
+            <w:shd w:fill="276FBF"/>
             <w:tcMar>
               <w:top w:w="70" w:type="dxa"/>
               <w:start w:w="100" w:type="dxa"/>
@@ -7222,7 +7222,7 @@
         <w:tc>
           <w:tcPr>
             <w:tcW w:type="dxa" w:w="4139"/>
-            <w:shd w:fill="1F6F5C"/>
+            <w:shd w:fill="276FBF"/>
             <w:tcMar>
               <w:top w:w="70" w:type="dxa"/>
               <w:start w:w="100" w:type="dxa"/>
@@ -7249,7 +7249,7 @@
         <w:tc>
           <w:tcPr>
             <w:tcW w:type="dxa" w:w="3742"/>
-            <w:shd w:fill="1F6F5C"/>
+            <w:shd w:fill="276FBF"/>
             <w:tcMar>
               <w:top w:w="70" w:type="dxa"/>
               <w:start w:w="100" w:type="dxa"/>
@@ -7764,7 +7764,7 @@
         <w:tc>
           <w:tcPr>
             <w:tcW w:type="dxa" w:w="2381"/>
-            <w:shd w:fill="1F6F5C"/>
+            <w:shd w:fill="276FBF"/>
             <w:tcMar>
               <w:top w:w="70" w:type="dxa"/>
               <w:start w:w="100" w:type="dxa"/>
@@ -7791,7 +7791,7 @@
         <w:tc>
           <w:tcPr>
             <w:tcW w:type="dxa" w:w="3061"/>
-            <w:shd w:fill="1F6F5C"/>
+            <w:shd w:fill="276FBF"/>
             <w:tcMar>
               <w:top w:w="70" w:type="dxa"/>
               <w:start w:w="100" w:type="dxa"/>
@@ -7818,7 +7818,7 @@
         <w:tc>
           <w:tcPr>
             <w:tcW w:type="dxa" w:w="4252"/>
-            <w:shd w:fill="1F6F5C"/>
+            <w:shd w:fill="276FBF"/>
             <w:tcMar>
               <w:top w:w="70" w:type="dxa"/>
               <w:start w:w="100" w:type="dxa"/>
@@ -8434,7 +8434,7 @@
         <w:tc>
           <w:tcPr>
             <w:tcW w:type="dxa" w:w="5102"/>
-            <w:shd w:fill="1F6F5C"/>
+            <w:shd w:fill="276FBF"/>
             <w:tcMar>
               <w:top w:w="70" w:type="dxa"/>
               <w:start w:w="100" w:type="dxa"/>
@@ -8461,7 +8461,7 @@
         <w:tc>
           <w:tcPr>
             <w:tcW w:type="dxa" w:w="4252"/>
-            <w:shd w:fill="1F6F5C"/>
+            <w:shd w:fill="276FBF"/>
             <w:tcMar>
               <w:top w:w="70" w:type="dxa"/>
               <w:start w:w="100" w:type="dxa"/>
@@ -8930,7 +8930,7 @@
         <w:tc>
           <w:tcPr>
             <w:tcW w:type="dxa" w:w="9412"/>
-            <w:shd w:fill="E7F3EC"/>
+            <w:shd w:fill="EAF2FB"/>
             <w:tcMar>
               <w:top w:w="100" w:type="dxa"/>
               <w:start w:w="140" w:type="dxa"/>
@@ -8943,7 +8943,7 @@
               <w:rPr>
                 <w:rFonts w:ascii="Microsoft YaHei" w:hAnsi="Microsoft YaHei" w:eastAsia="Microsoft YaHei"/>
                 <w:b/>
-                <w:color w:val="1F6F5C"/>
+                <w:color w:val="276FBF"/>
               </w:rPr>
               <w:t>最后一句</w:t>
             </w:r>
@@ -8968,7 +8968,7 @@
         <w:rPr>
           <w:rFonts w:ascii="Microsoft YaHei" w:hAnsi="Microsoft YaHei" w:eastAsia="Microsoft YaHei"/>
           <w:b w:val="0"/>
-          <w:color w:val="5F6E67"/>
+          <w:color w:val="64748B"/>
           <w:sz w:val="17"/>
         </w:rPr>
         <w:t>CET4Coach 大肥鱼版 v1.2-fish · 详细使用手册 · 2026-10</w:t>
@@ -8995,7 +8995,7 @@
     <w:r>
       <w:rPr>
         <w:rFonts w:ascii="Microsoft YaHei" w:hAnsi="Microsoft YaHei" w:eastAsia="Microsoft YaHei"/>
-        <w:color w:val="5F6E67"/>
+        <w:color w:val="64748B"/>
         <w:sz w:val="16"/>
       </w:rPr>
       <w:t xml:space="preserve">CET4Coach 详细使用手册  ·  </w:t>
@@ -9003,7 +9003,7 @@
     <w:r>
       <w:rPr>
         <w:rFonts w:ascii="Microsoft YaHei" w:hAnsi="Microsoft YaHei"/>
-        <w:color w:val="5F6E67"/>
+        <w:color w:val="64748B"/>
         <w:sz w:val="16"/>
       </w:rPr>
       <w:fldChar w:fldCharType="begin"/>
@@ -9382,7 +9382,7 @@
     </w:pPr>
     <w:rPr>
       <w:rFonts w:ascii="Microsoft YaHei" w:hAnsi="Microsoft YaHei" w:eastAsia="Microsoft YaHei"/>
-      <w:color w:val="23352F"/>
+      <w:color w:val="1F2937"/>
       <w:sz w:val="21"/>
     </w:rPr>
   </w:style>
@@ -9448,7 +9448,7 @@
       <w:rFonts w:asciiTheme="majorHAnsi" w:eastAsiaTheme="majorEastAsia" w:hAnsiTheme="majorHAnsi" w:cstheme="majorBidi" w:ascii="Microsoft YaHei" w:hAnsi="Microsoft YaHei" w:eastAsia="Microsoft YaHei"/>
       <w:b/>
       <w:bCs/>
-      <w:color w:val="1F6F5C"/>
+      <w:color w:val="276FBF"/>
       <w:sz w:val="36"/>
       <w:szCs w:val="28"/>
     </w:rPr>
@@ -9472,7 +9472,7 @@
       <w:rFonts w:asciiTheme="majorHAnsi" w:eastAsiaTheme="majorEastAsia" w:hAnsiTheme="majorHAnsi" w:cstheme="majorBidi" w:ascii="Microsoft YaHei" w:hAnsi="Microsoft YaHei" w:eastAsia="Microsoft YaHei"/>
       <w:b/>
       <w:bCs/>
-      <w:color w:val="1F6F5C"/>
+      <w:color w:val="276FBF"/>
       <w:sz w:val="26"/>
       <w:szCs w:val="26"/>
     </w:rPr>
@@ -9496,7 +9496,7 @@
       <w:rFonts w:asciiTheme="majorHAnsi" w:eastAsiaTheme="majorEastAsia" w:hAnsiTheme="majorHAnsi" w:cstheme="majorBidi" w:ascii="Microsoft YaHei" w:hAnsi="Microsoft YaHei" w:eastAsia="Microsoft YaHei"/>
       <w:b/>
       <w:bCs/>
-      <w:color w:val="B45F1E"/>
+      <w:color w:val="5B95D6"/>
       <w:sz w:val="23"/>
     </w:rPr>
   </w:style>

</xml_diff>